<commit_message>
v0.1.2 — open-folder button, right-click retrieve, parallel queries
Added since 0.1.1:
- Open download folder icon button in retrieve panel (opens Explorer)
- Right-click Retrieve in results tree context menu for single-item retrieval
- Parallel modality C-FIND queries (sync.WaitGroup); multi-modality search
  now takes ~1x query time instead of N x sequential time
- Results tree starts collapsed after search so series lazy-loading fires
  correctly on first expand
- Date field clear no longer shows validation error
- Version bump 0.1.1 -> 0.1.2
- CHANGELOG, user manual, and DOCX updated

Co-Authored-By: Claude Sonnet 4.6 <noreply@anthropic.com>
</commit_message>
<xml_diff>
--- a/dicomqr-user-manual.docx
+++ b/dicomqr-user-manual.docx
@@ -2,7 +2,7 @@
 <file path=word/document.xml><?xml version="1.0" encoding="utf-8"?>
 <w:document xmlns:w="http://schemas.openxmlformats.org/wordprocessingml/2006/main" xmlns:m="http://schemas.openxmlformats.org/officeDocument/2006/math" xmlns:r="http://schemas.openxmlformats.org/officeDocument/2006/relationships" xmlns:o="urn:schemas-microsoft-com:office:office" xmlns:v="urn:schemas-microsoft-com:vml" xmlns:w10="urn:schemas-microsoft-com:office:word" xmlns:a="http://schemas.openxmlformats.org/drawingml/2006/main" xmlns:pic="http://schemas.openxmlformats.org/drawingml/2006/picture" xmlns:wp="http://schemas.openxmlformats.org/drawingml/2006/wordprocessingDrawing">
   <w:body>
-    <w:bookmarkStart w:id="62" w:name="dicomqr-user-manual"/>
+    <w:bookmarkStart w:id="63" w:name="dicomqr-user-manual"/>
     <w:p>
       <w:pPr>
         <w:pStyle w:val="Heading1"/>
@@ -16,7 +16,7 @@
         <w:pStyle w:val="FirstParagraph"/>
       </w:pPr>
       <w:r>
-        <w:t xml:space="preserve">Version 0.1.0</w:t>
+        <w:t xml:space="preserve">Version 0.1.2</w:t>
       </w:r>
     </w:p>
     <w:p>
@@ -3566,7 +3566,7 @@
               <w:rPr>
                 <w:rStyle w:val="VerbatimChar"/>
               </w:rPr>
-              <w:t xml:space="preserve">v0.1.0</w:t>
+              <w:t xml:space="preserve">v0.1.2</w:t>
             </w:r>
           </w:p>
         </w:tc>
@@ -4844,7 +4844,7 @@
       </w:r>
     </w:p>
     <w:bookmarkEnd w:id="49"/>
-    <w:bookmarkStart w:id="61" w:name="appendix-c-credits-and-acknowledgements"/>
+    <w:bookmarkStart w:id="62" w:name="appendix-c-credits-and-acknowledgements"/>
     <w:p>
       <w:pPr>
         <w:pStyle w:val="Heading2"/>
@@ -4853,7 +4853,7 @@
         <w:t xml:space="preserve">Appendix C: Credits and Acknowledgements</w:t>
       </w:r>
     </w:p>
-    <w:bookmarkStart w:id="52" w:name="developer"/>
+    <w:bookmarkStart w:id="50" w:name="developer"/>
     <w:p>
       <w:pPr>
         <w:pStyle w:val="Heading3"/>
@@ -4866,12 +4866,6 @@
       <w:pPr>
         <w:pStyle w:val="FirstParagraph"/>
       </w:pPr>
-      <w:r>
-        <w:t xml:space="preserve">dicomqr was written by</w:t>
-      </w:r>
-      <w:r>
-        <w:t xml:space="preserve"> </w:t>
-      </w:r>
       <w:r>
         <w:rPr>
           <w:b/>
@@ -4883,36 +4877,17 @@
         <w:t xml:space="preserve"> </w:t>
       </w:r>
       <w:r>
-        <w:t xml:space="preserve">(</w:t>
-      </w:r>
-      <w:hyperlink r:id="rId50">
-        <w:r>
-          <w:rPr>
-            <w:rStyle w:val="Hyperlink"/>
-          </w:rPr>
-          <w:t xml:space="preserve">jeffrey.leal@gmail.com</w:t>
-        </w:r>
-      </w:hyperlink>
-      <w:r>
-        <w:t xml:space="preserve">,</w:t>
-      </w:r>
-      <w:r>
-        <w:t xml:space="preserve"> </w:t>
-      </w:r>
-      <w:hyperlink r:id="rId51">
-        <w:r>
-          <w:rPr>
-            <w:rStyle w:val="Hyperlink"/>
-          </w:rPr>
-          <w:t xml:space="preserve">github.com/jeffrey-leal</w:t>
-        </w:r>
-      </w:hyperlink>
-      <w:r>
-        <w:t xml:space="preserve">).</w:t>
-      </w:r>
-    </w:p>
-    <w:bookmarkEnd w:id="52"/>
-    <w:bookmarkStart w:id="54" w:name="ai-assistance"/>
+        <w:t xml:space="preserve">Email: jeffrey.leal@gmail.com</w:t>
+      </w:r>
+      <w:r>
+        <w:t xml:space="preserve"> </w:t>
+      </w:r>
+      <w:r>
+        <w:t xml:space="preserve">GitHub: https://github.com/jeffrey-leal</w:t>
+      </w:r>
+    </w:p>
+    <w:bookmarkEnd w:id="50"/>
+    <w:bookmarkStart w:id="52" w:name="ai-assistance"/>
     <w:p>
       <w:pPr>
         <w:pStyle w:val="Heading3"/>
@@ -4926,7 +4901,7 @@
         <w:pStyle w:val="FirstParagraph"/>
       </w:pPr>
       <w:r>
-        <w:t xml:space="preserve">This application was developed with assistance from</w:t>
+        <w:t xml:space="preserve">This application was designed and developed with the assistance of</w:t>
       </w:r>
       <w:r>
         <w:t xml:space="preserve"> </w:t>
@@ -4939,12 +4914,15 @@
         <w:t xml:space="preserve">Claude Sonnet 4.6</w:t>
       </w:r>
       <w:r>
-        <w:t xml:space="preserve">, an AI assistant created by</w:t>
-      </w:r>
-      <w:r>
-        <w:t xml:space="preserve"> </w:t>
-      </w:r>
-      <w:hyperlink r:id="rId53">
+        <w:t xml:space="preserve"> </w:t>
+      </w:r>
+      <w:r>
+        <w:t xml:space="preserve">by</w:t>
+      </w:r>
+      <w:r>
+        <w:t xml:space="preserve"> </w:t>
+      </w:r>
+      <w:hyperlink r:id="rId51">
         <w:r>
           <w:rPr>
             <w:rStyle w:val="Hyperlink"/>
@@ -4953,25 +4931,119 @@
         </w:r>
       </w:hyperlink>
       <w:r>
-        <w:t xml:space="preserve">.</w:t>
+        <w:t xml:space="preserve">. Architecture planning, code generation, DICOM standard research, and documentation were produced in collaboration with Claude Code.</w:t>
+      </w:r>
+    </w:p>
+    <w:bookmarkEnd w:id="52"/>
+    <w:bookmarkStart w:id="53" w:name="ui-template"/>
+    <w:p>
+      <w:pPr>
+        <w:pStyle w:val="Heading3"/>
+      </w:pPr>
+      <w:r>
+        <w:t xml:space="preserve">UI Template</w:t>
+      </w:r>
+    </w:p>
+    <w:p>
+      <w:pPr>
+        <w:pStyle w:val="FirstParagraph"/>
+      </w:pPr>
+      <w:r>
+        <w:t xml:space="preserve">This application’s structure, conventions, and UI patterns are derived from</w:t>
+      </w:r>
+      <w:r>
+        <w:t xml:space="preserve"> </w:t>
+      </w:r>
+      <w:r>
+        <w:rPr>
+          <w:b/>
+          <w:bCs/>
+        </w:rPr>
+        <w:t xml:space="preserve">dicomhdr</w:t>
+      </w:r>
+      <w:r>
+        <w:t xml:space="preserve"> </w:t>
+      </w:r>
+      <w:r>
+        <w:t xml:space="preserve">— a Fyne-based DICOM file inspector by the same developer.</w:t>
+      </w:r>
+      <w:r>
+        <w:t xml:space="preserve"> </w:t>
+      </w:r>
+      <w:r>
+        <w:t xml:space="preserve">https://github.com/jeffrey-leal/dicomhdr</w:t>
+      </w:r>
+    </w:p>
+    <w:bookmarkEnd w:id="53"/>
+    <w:bookmarkStart w:id="54" w:name="dicom-standard-reference"/>
+    <w:p>
+      <w:pPr>
+        <w:pStyle w:val="Heading3"/>
+      </w:pPr>
+      <w:r>
+        <w:t xml:space="preserve">DICOM Standard Reference</w:t>
+      </w:r>
+    </w:p>
+    <w:p>
+      <w:pPr>
+        <w:pStyle w:val="FirstParagraph"/>
+      </w:pPr>
+      <w:r>
+        <w:t xml:space="preserve">Protocol implementation follows the DICOM Standard published by NEMA:</w:t>
+      </w:r>
+    </w:p>
+    <w:p>
+      <w:pPr>
+        <w:pStyle w:val="BodyText"/>
+      </w:pPr>
+      <w:r>
+        <w:rPr>
+          <w:b/>
+          <w:bCs/>
+        </w:rPr>
+        <w:t xml:space="preserve">DICOM PS3 (2024b)</w:t>
+      </w:r>
+      <w:r>
+        <w:t xml:space="preserve"> </w:t>
+      </w:r>
+      <w:r>
+        <w:t xml:space="preserve">— https://dicom.nema.org/medical/dicom/current</w:t>
+      </w:r>
+    </w:p>
+    <w:p>
+      <w:pPr>
+        <w:pStyle w:val="BodyText"/>
+      </w:pPr>
+      <w:r>
+        <w:t xml:space="preserve">Sections referenced:</w:t>
+      </w:r>
+      <w:r>
+        <w:t xml:space="preserve"> </w:t>
+      </w:r>
+      <w:r>
+        <w:t xml:space="preserve">- PS3.4 — Service Class Specifications (Query/Retrieve, C.4)</w:t>
+      </w:r>
+      <w:r>
+        <w:t xml:space="preserve"> </w:t>
+      </w:r>
+      <w:r>
+        <w:t xml:space="preserve">- PS3.7 — Message Exchange (DIMSE-C services: C-ECHO, C-FIND, C-MOVE, C-STORE)</w:t>
+      </w:r>
+      <w:r>
+        <w:t xml:space="preserve"> </w:t>
+      </w:r>
+      <w:r>
+        <w:t xml:space="preserve">- PS3.8 — Network Communication / DICOM Upper Layer Protocol</w:t>
       </w:r>
     </w:p>
     <w:bookmarkEnd w:id="54"/>
-    <w:bookmarkStart w:id="60" w:name="open-source-libraries"/>
+    <w:bookmarkStart w:id="61" w:name="open-source-libraries"/>
     <w:p>
       <w:pPr>
         <w:pStyle w:val="Heading3"/>
       </w:pPr>
       <w:r>
         <w:t xml:space="preserve">Open-Source Libraries</w:t>
-      </w:r>
-    </w:p>
-    <w:p>
-      <w:pPr>
-        <w:pStyle w:val="FirstParagraph"/>
-      </w:pPr>
-      <w:r>
-        <w:t xml:space="preserve">dicomqr is built on the following open-source projects:</w:t>
       </w:r>
     </w:p>
     <w:tbl>
@@ -4982,9 +5054,10 @@
         <w:tblLook w:firstRow="1" w:lastRow="0" w:firstColumn="0" w:lastColumn="0" w:noHBand="0" w:noVBand="0" w:val="0020"/>
       </w:tblPr>
       <w:tblGrid>
-        <w:gridCol w:w="2640"/>
-        <w:gridCol w:w="2640"/>
-        <w:gridCol w:w="2640"/>
+        <w:gridCol w:w="1980"/>
+        <w:gridCol w:w="1980"/>
+        <w:gridCol w:w="1980"/>
+        <w:gridCol w:w="1980"/>
       </w:tblGrid>
       <w:tr>
         <w:trPr>
@@ -5008,7 +5081,18 @@
               <w:pStyle w:val="Compact"/>
             </w:pPr>
             <w:r>
-              <w:t xml:space="preserve">Repository</w:t>
+              <w:t xml:space="preserve">Author / Maintainer</w:t>
+            </w:r>
+          </w:p>
+        </w:tc>
+        <w:tc>
+          <w:tcPr/>
+          <w:p>
+            <w:pPr>
+              <w:pStyle w:val="Compact"/>
+            </w:pPr>
+            <w:r>
+              <w:t xml:space="preserve">Licence</w:t>
             </w:r>
           </w:p>
         </w:tc>
@@ -5025,17 +5109,6 @@
         </w:tc>
       </w:tr>
       <w:tr>
-        <w:tc>
-          <w:tcPr/>
-          <w:p>
-            <w:pPr>
-              <w:pStyle w:val="Compact"/>
-            </w:pPr>
-            <w:r>
-              <w:t xml:space="preserve">Fyne</w:t>
-            </w:r>
-          </w:p>
-        </w:tc>
         <w:tc>
           <w:tcPr/>
           <w:p>
@@ -5050,32 +5123,49 @@
                 <w:t xml:space="preserve">fyne.io/fyne/v2</w:t>
               </w:r>
             </w:hyperlink>
-          </w:p>
-        </w:tc>
-        <w:tc>
-          <w:tcPr/>
-          <w:p>
-            <w:pPr>
-              <w:pStyle w:val="Compact"/>
-            </w:pPr>
-            <w:r>
-              <w:t xml:space="preserve">Cross-platform GUI framework</w:t>
-            </w:r>
-          </w:p>
-        </w:tc>
-      </w:tr>
-      <w:tr>
-        <w:tc>
-          <w:tcPr/>
-          <w:p>
-            <w:pPr>
-              <w:pStyle w:val="Compact"/>
-            </w:pPr>
-            <w:r>
-              <w:t xml:space="preserve">go-netdicom</w:t>
-            </w:r>
-          </w:p>
-        </w:tc>
+            <w:r>
+              <w:t xml:space="preserve"> </w:t>
+            </w:r>
+            <w:r>
+              <w:t xml:space="preserve">v2.7.3</w:t>
+            </w:r>
+          </w:p>
+        </w:tc>
+        <w:tc>
+          <w:tcPr/>
+          <w:p>
+            <w:pPr>
+              <w:pStyle w:val="Compact"/>
+            </w:pPr>
+            <w:r>
+              <w:t xml:space="preserve">Fyne.io contributors</w:t>
+            </w:r>
+          </w:p>
+        </w:tc>
+        <w:tc>
+          <w:tcPr/>
+          <w:p>
+            <w:pPr>
+              <w:pStyle w:val="Compact"/>
+            </w:pPr>
+            <w:r>
+              <w:t xml:space="preserve">BSD 3-Clause</w:t>
+            </w:r>
+          </w:p>
+        </w:tc>
+        <w:tc>
+          <w:tcPr/>
+          <w:p>
+            <w:pPr>
+              <w:pStyle w:val="Compact"/>
+            </w:pPr>
+            <w:r>
+              <w:t xml:space="preserve">GUI framework</w:t>
+            </w:r>
+          </w:p>
+        </w:tc>
+      </w:tr>
+      <w:tr>
         <w:tc>
           <w:tcPr/>
           <w:p>
@@ -5087,35 +5177,52 @@
                 <w:rPr>
                   <w:rStyle w:val="Hyperlink"/>
                 </w:rPr>
-                <w:t xml:space="preserve">github.com/algm/go-netdicom</w:t>
+                <w:t xml:space="preserve">algm/go-netdicom</w:t>
               </w:r>
             </w:hyperlink>
-          </w:p>
-        </w:tc>
-        <w:tc>
-          <w:tcPr/>
-          <w:p>
-            <w:pPr>
-              <w:pStyle w:val="Compact"/>
-            </w:pPr>
-            <w:r>
-              <w:t xml:space="preserve">DICOM networking (C-ECHO, C-FIND, C-MOVE SCU; C-STORE SCP)</w:t>
-            </w:r>
-          </w:p>
-        </w:tc>
-      </w:tr>
-      <w:tr>
-        <w:tc>
-          <w:tcPr/>
-          <w:p>
-            <w:pPr>
-              <w:pStyle w:val="Compact"/>
-            </w:pPr>
-            <w:r>
-              <w:t xml:space="preserve">go-dicom (grailbio)</w:t>
-            </w:r>
-          </w:p>
-        </w:tc>
+            <w:r>
+              <w:t xml:space="preserve"> </w:t>
+            </w:r>
+            <w:r>
+              <w:t xml:space="preserve">v0.1.0</w:t>
+            </w:r>
+          </w:p>
+        </w:tc>
+        <w:tc>
+          <w:tcPr/>
+          <w:p>
+            <w:pPr>
+              <w:pStyle w:val="Compact"/>
+            </w:pPr>
+            <w:r>
+              <w:t xml:space="preserve">Alan Griffin (fork of grailbio)</w:t>
+            </w:r>
+          </w:p>
+        </w:tc>
+        <w:tc>
+          <w:tcPr/>
+          <w:p>
+            <w:pPr>
+              <w:pStyle w:val="Compact"/>
+            </w:pPr>
+            <w:r>
+              <w:t xml:space="preserve">BSD 3-Clause</w:t>
+            </w:r>
+          </w:p>
+        </w:tc>
+        <w:tc>
+          <w:tcPr/>
+          <w:p>
+            <w:pPr>
+              <w:pStyle w:val="Compact"/>
+            </w:pPr>
+            <w:r>
+              <w:t xml:space="preserve">DICOM network protocol (C-ECHO, C-FIND, C-MOVE, C-STORE SCP)</w:t>
+            </w:r>
+          </w:p>
+        </w:tc>
+      </w:tr>
+      <w:tr>
         <w:tc>
           <w:tcPr/>
           <w:p>
@@ -5127,7 +5234,7 @@
                 <w:rPr>
                   <w:rStyle w:val="Hyperlink"/>
                 </w:rPr>
-                <w:t xml:space="preserve">github.com/grailbio/go-dicom</w:t>
+                <w:t xml:space="preserve">grailbio/go-netdicom</w:t>
               </w:r>
             </w:hyperlink>
           </w:p>
@@ -5139,23 +5246,34 @@
               <w:pStyle w:val="Compact"/>
             </w:pPr>
             <w:r>
-              <w:t xml:space="preserve">DICOM tag definitions and element parsing</w:t>
-            </w:r>
-          </w:p>
-        </w:tc>
-      </w:tr>
-      <w:tr>
-        <w:tc>
-          <w:tcPr/>
-          <w:p>
-            <w:pPr>
-              <w:pStyle w:val="Compact"/>
-            </w:pPr>
-            <w:r>
-              <w:t xml:space="preserve">go-dicom (suyashkumar)</w:t>
-            </w:r>
-          </w:p>
-        </w:tc>
+              <w:t xml:space="preserve">Yasushi Saito / GRAIL Inc.</w:t>
+            </w:r>
+          </w:p>
+        </w:tc>
+        <w:tc>
+          <w:tcPr/>
+          <w:p>
+            <w:pPr>
+              <w:pStyle w:val="Compact"/>
+            </w:pPr>
+            <w:r>
+              <w:t xml:space="preserve">BSD 3-Clause</w:t>
+            </w:r>
+          </w:p>
+        </w:tc>
+        <w:tc>
+          <w:tcPr/>
+          <w:p>
+            <w:pPr>
+              <w:pStyle w:val="Compact"/>
+            </w:pPr>
+            <w:r>
+              <w:t xml:space="preserve">Original DICOM networking library (base of go-netdicom fork)</w:t>
+            </w:r>
+          </w:p>
+        </w:tc>
+      </w:tr>
+      <w:tr>
         <w:tc>
           <w:tcPr/>
           <w:p>
@@ -5167,7 +5285,7 @@
                 <w:rPr>
                   <w:rStyle w:val="Hyperlink"/>
                 </w:rPr>
-                <w:t xml:space="preserve">github.com/suyashkumar/dicom</w:t>
+                <w:t xml:space="preserve">grailbio/go-dicom</w:t>
               </w:r>
             </w:hyperlink>
           </w:p>
@@ -5179,23 +5297,34 @@
               <w:pStyle w:val="Compact"/>
             </w:pPr>
             <w:r>
-              <w:t xml:space="preserve">DICOM file reading for received files</w:t>
-            </w:r>
-          </w:p>
-        </w:tc>
-      </w:tr>
-      <w:tr>
-        <w:tc>
-          <w:tcPr/>
-          <w:p>
-            <w:pPr>
-              <w:pStyle w:val="Compact"/>
-            </w:pPr>
-            <w:r>
-              <w:t xml:space="preserve">dialog</w:t>
-            </w:r>
-          </w:p>
-        </w:tc>
+              <w:t xml:space="preserve">GRAIL Inc.</w:t>
+            </w:r>
+          </w:p>
+        </w:tc>
+        <w:tc>
+          <w:tcPr/>
+          <w:p>
+            <w:pPr>
+              <w:pStyle w:val="Compact"/>
+            </w:pPr>
+            <w:r>
+              <w:t xml:space="preserve">Apache 2.0</w:t>
+            </w:r>
+          </w:p>
+        </w:tc>
+        <w:tc>
+          <w:tcPr/>
+          <w:p>
+            <w:pPr>
+              <w:pStyle w:val="Compact"/>
+            </w:pPr>
+            <w:r>
+              <w:t xml:space="preserve">DICOM dataset encoding / file header writing</w:t>
+            </w:r>
+          </w:p>
+        </w:tc>
+      </w:tr>
+      <w:tr>
         <w:tc>
           <w:tcPr/>
           <w:p>
@@ -5207,19 +5336,98 @@
                 <w:rPr>
                   <w:rStyle w:val="Hyperlink"/>
                 </w:rPr>
-                <w:t xml:space="preserve">github.com/sqweek/dialog</w:t>
+                <w:t xml:space="preserve">suyashkumar/dicom</w:t>
               </w:r>
             </w:hyperlink>
-          </w:p>
-        </w:tc>
-        <w:tc>
-          <w:tcPr/>
-          <w:p>
-            <w:pPr>
-              <w:pStyle w:val="Compact"/>
-            </w:pPr>
-            <w:r>
-              <w:t xml:space="preserve">Native Windows file and folder picker dialogs</w:t>
+            <w:r>
+              <w:t xml:space="preserve"> </w:t>
+            </w:r>
+            <w:r>
+              <w:t xml:space="preserve">v1.1.0</w:t>
+            </w:r>
+          </w:p>
+        </w:tc>
+        <w:tc>
+          <w:tcPr/>
+          <w:p>
+            <w:pPr>
+              <w:pStyle w:val="Compact"/>
+            </w:pPr>
+            <w:r>
+              <w:t xml:space="preserve">Suyash Kumar</w:t>
+            </w:r>
+          </w:p>
+        </w:tc>
+        <w:tc>
+          <w:tcPr/>
+          <w:p>
+            <w:pPr>
+              <w:pStyle w:val="Compact"/>
+            </w:pPr>
+            <w:r>
+              <w:t xml:space="preserve">MIT</w:t>
+            </w:r>
+          </w:p>
+        </w:tc>
+        <w:tc>
+          <w:tcPr/>
+          <w:p>
+            <w:pPr>
+              <w:pStyle w:val="Compact"/>
+            </w:pPr>
+            <w:r>
+              <w:t xml:space="preserve">DICOM file parsing for received files</w:t>
+            </w:r>
+          </w:p>
+        </w:tc>
+      </w:tr>
+      <w:tr>
+        <w:tc>
+          <w:tcPr/>
+          <w:p>
+            <w:pPr>
+              <w:pStyle w:val="Compact"/>
+            </w:pPr>
+            <w:hyperlink r:id="rId60">
+              <w:r>
+                <w:rPr>
+                  <w:rStyle w:val="Hyperlink"/>
+                </w:rPr>
+                <w:t xml:space="preserve">sqweek/dialog</w:t>
+              </w:r>
+            </w:hyperlink>
+          </w:p>
+        </w:tc>
+        <w:tc>
+          <w:tcPr/>
+          <w:p>
+            <w:pPr>
+              <w:pStyle w:val="Compact"/>
+            </w:pPr>
+            <w:r>
+              <w:t xml:space="preserve">sqweek</w:t>
+            </w:r>
+          </w:p>
+        </w:tc>
+        <w:tc>
+          <w:tcPr/>
+          <w:p>
+            <w:pPr>
+              <w:pStyle w:val="Compact"/>
+            </w:pPr>
+            <w:r>
+              <w:t xml:space="preserve">ISC</w:t>
+            </w:r>
+          </w:p>
+        </w:tc>
+        <w:tc>
+          <w:tcPr/>
+          <w:p>
+            <w:pPr>
+              <w:pStyle w:val="Compact"/>
+            </w:pPr>
+            <w:r>
+              <w:t xml:space="preserve">Native Windows file/folder picker dialogs</w:t>
             </w:r>
           </w:p>
         </w:tc>
@@ -5230,12 +5438,42 @@
         <w:pStyle w:val="BodyText"/>
       </w:pPr>
       <w:r>
-        <w:t xml:space="preserve">All libraries are used under their respective open-source licences.</w:t>
-      </w:r>
-    </w:p>
-    <w:bookmarkEnd w:id="60"/>
+        <w:t xml:space="preserve">All libraries are used under their respective open-source licences. A vendored copy of</w:t>
+      </w:r>
+      <w:r>
+        <w:t xml:space="preserve"> </w:t>
+      </w:r>
+      <w:r>
+        <w:rPr>
+          <w:rStyle w:val="VerbatimChar"/>
+        </w:rPr>
+        <w:t xml:space="preserve">algm/go-netdicom</w:t>
+      </w:r>
+      <w:r>
+        <w:t xml:space="preserve"> </w:t>
+      </w:r>
+      <w:r>
+        <w:t xml:space="preserve">is included under</w:t>
+      </w:r>
+      <w:r>
+        <w:t xml:space="preserve"> </w:t>
+      </w:r>
+      <w:r>
+        <w:rPr>
+          <w:rStyle w:val="VerbatimChar"/>
+        </w:rPr>
+        <w:t xml:space="preserve">thirdparty/go-netdicom</w:t>
+      </w:r>
+      <w:r>
+        <w:t xml:space="preserve"> </w:t>
+      </w:r>
+      <w:r>
+        <w:t xml:space="preserve">with its original BSD 3-Clause licence intact.</w:t>
+      </w:r>
+    </w:p>
     <w:bookmarkEnd w:id="61"/>
     <w:bookmarkEnd w:id="62"/>
+    <w:bookmarkEnd w:id="63"/>
     <w:sectPr>
       <w:footnotePr>
         <w:numRestart w:val="eachSect"/>

</xml_diff>

<commit_message>
Release v1.2.0 — uncompressed transfer option, viewer pixel data robustness
Version bump to 1.2.0.

New feature: TransferUncompressed flag per server profile restricts
A-ASSOCIATE-RQ to Explicit/Implicit VR Little Endian only for both
C-GET SCU and C-MOVE SCP.

Bug fixes:
- Viewer shows a clear message for JPEG 2000, JPEG-LS, JPEG Lossless,
  and RLE Lossless files instead of cryptic missing-SOI-marker JPEG error.
- Viewer raw-pixel fallback decodes uncompressed files wrapped in
  undefined-length PixelData sequences (vendor non-conformance), fixing
  the same-data-works-on-one-system-but-not-another behaviour.

Documentation: CHANGELOG, user manual (.md and .docx), gendoc updated.

Co-Authored-By: Claude Sonnet 4.6 <noreply@anthropic.com>
</commit_message>
<xml_diff>
--- a/dicomqr-user-manual.docx
+++ b/dicomqr-user-manual.docx
@@ -71,7 +71,7 @@
           <w:sz w:val="32"/>
           <w:szCs w:val="32"/>
         </w:rPr>
-        <w:t xml:space="preserve">User Manual  v1.1.0</w:t>
+        <w:t xml:space="preserve">User Manual  v1.2.0</w:t>
       </w:r>
     </w:p>
     <w:p>
@@ -211,6 +211,14 @@
       </w:pPr>
       <w:r>
         <w:t xml:space="preserve">Support for multiple saved server profiles with independent connection and retrieve settings</w:t>
+      </w:r>
+    </w:p>
+    <w:p>
+      <w:pPr>
+        <w:pStyle w:val="ListBullet"/>
+      </w:pPr>
+      <w:r>
+        <w:t xml:space="preserve">Optionally request uncompressed pixel data transfer per server profile, ensuring the built-in viewer can display all received images regardless of how the PACS stores them</w:t>
       </w:r>
     </w:p>
     <w:p>
@@ -961,6 +969,30 @@
           </w:p>
         </w:tc>
       </w:tr>
+      <w:tr>
+        <w:tc>
+          <w:tcPr>
+            <w:tcW w:w="2700" w:type="dxa"/>
+            <w:shd w:val="clear" w:color="auto" w:fill="F5F5F5"/>
+          </w:tcPr>
+          <w:p>
+            <w:r>
+              <w:t xml:space="preserve">Transfer</w:t>
+            </w:r>
+          </w:p>
+        </w:tc>
+        <w:tc>
+          <w:tcPr>
+            <w:tcW w:w="6300" w:type="dxa"/>
+            <w:shd w:val="clear" w:color="auto" w:fill="F5F5F5"/>
+          </w:tcPr>
+          <w:p>
+            <w:r>
+              <w:t xml:space="preserve">When 'Request uncompressed transfer syntax only' is ticked, dicomqr restricts its A-ASSOCIATE negotiation to Explicit VR Little Endian and Implicit VR Little Endian only. A conformant PACS must transcode compressed pixel data before sending. Useful when the PACS stores data in JPEG 2000 or JPEG-LS format that the built-in viewer cannot decode. Leave unticked unless needed — some PACS systems cannot transcode and will fail the transfer.</w:t>
+            </w:r>
+          </w:p>
+        </w:tc>
+      </w:tr>
     </w:tbl>
     <w:p/>
     <w:p>
@@ -2287,6 +2319,11 @@
       </w:r>
     </w:p>
     <w:p>
+      <w:r>
+        <w:t xml:space="preserve">Compressed pixel data — the built-in viewer decodes JPEG Baseline and uncompressed (native) pixel data. Files stored in JPEG 2000, JPEG-LS, JPEG Lossless, or RLE Lossless formats cannot be decoded and display a message explaining the limitation with a suggestion to use Open in Viewer. To avoid this, enable 'Request uncompressed transfer syntax only' in the server profile before retrieving (see Section 4.1).</w:t>
+      </w:r>
+    </w:p>
+    <w:p>
       <w:pPr>
         <w:pStyle w:val="Heading3"/>
       </w:pPr>
@@ -4225,6 +4262,30 @@
           </w:p>
         </w:tc>
       </w:tr>
+      <w:tr>
+        <w:tc>
+          <w:tcPr>
+            <w:tcW w:w="2700" w:type="dxa"/>
+            <w:shd w:val="clear" w:color="auto" w:fill="F5F5F5"/>
+          </w:tcPr>
+          <w:p>
+            <w:r>
+              <w:t xml:space="preserve">Transfer</w:t>
+            </w:r>
+          </w:p>
+        </w:tc>
+        <w:tc>
+          <w:tcPr>
+            <w:tcW w:w="6300" w:type="dxa"/>
+            <w:shd w:val="clear" w:color="auto" w:fill="F5F5F5"/>
+          </w:tcPr>
+          <w:p>
+            <w:r>
+              <w:t xml:space="preserve">When ticked, negotiates only uncompressed transfer syntaxes — see Section 4.1 for full details and caveats.</w:t>
+            </w:r>
+          </w:p>
+        </w:tc>
+      </w:tr>
     </w:tbl>
     <w:p/>
     <w:p>
@@ -4552,7 +4613,7 @@
                 <w:szCs w:val="18"/>
                 <w:shd w:val="clear" w:color="auto" w:fill="EBEBEB"/>
               </w:rPr>
-              <w:t xml:space="preserve">v1.1.0</w:t>
+              <w:t xml:space="preserve">v1.2.0</w:t>
             </w:r>
           </w:p>
         </w:tc>
@@ -6183,6 +6244,36 @@
           </w:p>
         </w:tc>
       </w:tr>
+      <w:tr>
+        <w:tc>
+          <w:tcPr>
+            <w:tcW w:w="2700" w:type="dxa"/>
+            <w:shd w:val="clear" w:color="auto" w:fill="F5F5F5"/>
+          </w:tcPr>
+          <w:p>
+            <w:r>
+              <w:rPr>
+                <w:rFonts w:ascii="Courier New" w:hAnsi="Courier New"/>
+                <w:sz w:val="18"/>
+                <w:szCs w:val="18"/>
+                <w:shd w:val="clear" w:color="auto" w:fill="EBEBEB"/>
+              </w:rPr>
+              <w:t xml:space="preserve">transferUncompressed</w:t>
+            </w:r>
+          </w:p>
+        </w:tc>
+        <w:tc>
+          <w:tcPr>
+            <w:tcW w:w="6300" w:type="dxa"/>
+            <w:shd w:val="clear" w:color="auto" w:fill="F5F5F5"/>
+          </w:tcPr>
+          <w:p>
+            <w:r>
+              <w:t xml:space="preserve">When true, the A-ASSOCIATE negotiation for C-GET and C-MOVE offers only uncompressed transfer syntaxes. Default: false.</w:t>
+            </w:r>
+          </w:p>
+        </w:tc>
+      </w:tr>
     </w:tbl>
     <w:p/>
     <w:p>
@@ -6226,6 +6317,11 @@
     <w:p>
       <w:r>
         <w:t xml:space="preserve">Worklist server — The Modality Worklist SOP class is typically served by a RIS or dedicated MWL broker, not the PACS itself. Create a separate server profile pointing to that system and select it in the Worklist tab.</w:t>
+      </w:r>
+    </w:p>
+    <w:p>
+      <w:r>
+        <w:t xml:space="preserve">Compressed pixel data — if the PACS stores images in JPEG 2000, JPEG-LS, or other compressed formats that the built-in viewer cannot decode, enable 'Request uncompressed transfer syntax only' in the server profile. The PACS will transcode on the fly if it supports transcoding. If the PACS does not support transcoding, the transfer will fail for those SOP classes; use the external viewer integration instead.</w:t>
       </w:r>
     </w:p>
     <w:p>

</xml_diff>

<commit_message>
Release v1.3.0 — interactive image viewer and modality W/L presets
Version bump to 1.3.0.

Added:
- Interactive series viewer: left-drag window/level, right-drag zoom,
  middle-drag pan, wheel/arrow slice navigation, keyboard shortcuts,
  and a Reset button. W/L and zoom/pan persist across slices.
- Modality-specific window/level presets (CT Hounsfield, PET fraction-of-
  peak, MR relative-contrast, generic), plus Default and Full range.

Fixed:
- Results filter showed all patients when the filter matched nothing.
- Window/level dragging flicker, first-move jump, and a Window/Level
  axis swap: GPU scaling (ImageScaleFastest), reused windowing buffer,
  deferred overlay rebuild, and absolute-displacement math anchored to
  the press point.

Docs: CHANGELOG, user manual (.md and .docx), and gendoc updated.

Co-Authored-By: Claude Opus 4.8 <noreply@anthropic.com>
</commit_message>
<xml_diff>
--- a/dicomqr-user-manual.docx
+++ b/dicomqr-user-manual.docx
@@ -71,7 +71,7 @@
           <w:sz w:val="32"/>
           <w:szCs w:val="32"/>
         </w:rPr>
-        <w:t xml:space="preserve">User Manual  v1.2.0</w:t>
+        <w:t xml:space="preserve">User Manual  v1.3.0</w:t>
       </w:r>
     </w:p>
     <w:p>
@@ -85,7 +85,7 @@
           <w:sz w:val="24"/>
           <w:szCs w:val="24"/>
         </w:rPr>
-        <w:t xml:space="preserve">June 17, 2026</w:t>
+        <w:t xml:space="preserve">June 18, 2026</w:t>
       </w:r>
     </w:p>
     <w:p>
@@ -2277,7 +2277,7 @@
         <w:pStyle w:val="ListBullet"/>
       </w:pPr>
       <w:r>
-        <w:t xml:space="preserve">Study node — opens the study overview grid (see Section 8.3.2).</w:t>
+        <w:t xml:space="preserve">Study node — opens the study overview grid (see Section 8.3.3).</w:t>
       </w:r>
     </w:p>
     <w:p>
@@ -2298,7 +2298,7 @@
     </w:p>
     <w:p>
       <w:r>
-        <w:t xml:space="preserve">The series viewer displays one image at a time with a slider to navigate through the sorted series. It opens at the middle slice.</w:t>
+        <w:t xml:space="preserve">The series viewer displays one image at a time and opens at the middle slice. It supports interactive window/level, zoom and pan, and slice navigation by mouse or keyboard.</w:t>
       </w:r>
     </w:p>
     <w:p>
@@ -2315,38 +2315,12 @@
         <w:t xml:space="preserve">45 / 120</w:t>
       </w:r>
       <w:r>
-        <w:t xml:space="preserve">), a navigation slider, an Annotations checkbox (see Section 8.3.3), and an info label showing pixel dimensions and W/L values.</w:t>
-      </w:r>
-    </w:p>
-    <w:p>
-      <w:r>
-        <w:t xml:space="preserve">Compressed pixel data — the built-in viewer decodes JPEG Baseline and uncompressed (native) pixel data. Files stored in JPEG 2000, JPEG-LS, JPEG Lossless, or RLE Lossless formats cannot be decoded and display a message explaining the limitation with a suggestion to use Open in Viewer. To avoid this, enable 'Request uncompressed transfer syntax only' in the server profile before retrieving (see Section 4.1).</w:t>
-      </w:r>
-    </w:p>
-    <w:p>
-      <w:pPr>
-        <w:pStyle w:val="Heading3"/>
-      </w:pPr>
-      <w:r>
-        <w:t>8.3.2  Study Overview Grid</w:t>
-      </w:r>
-    </w:p>
-    <w:p>
-      <w:r>
-        <w:t xml:space="preserve">The overview window shows one thumbnail per series — the middle slice of each series rendered in parallel. Thumbnails are arranged in a three-column grid. Double-click any thumbnail to open that series in the full series viewer.</w:t>
-      </w:r>
-    </w:p>
-    <w:p>
-      <w:pPr>
-        <w:pStyle w:val="Heading3"/>
-      </w:pPr>
-      <w:r>
-        <w:t>8.3.3  DICOM Annotation Overlay</w:t>
-      </w:r>
-    </w:p>
-    <w:p>
-      <w:r>
-        <w:t xml:space="preserve">When Annotations is checked in the series viewer, a four-corner overlay is drawn within the actual image area (never in the letterbox bars):</w:t>
+        <w:t xml:space="preserve">), a navigation slider, a Window preset dropdown (see Section 8.3.2), an Annotations checkbox (see Section 8.3.4), a Reset button, and an info label showing pixel dimensions and the current W/L values.</w:t>
+      </w:r>
+    </w:p>
+    <w:p>
+      <w:r>
+        <w:t xml:space="preserve">Mouse controls:</w:t>
       </w:r>
     </w:p>
     <w:tbl>
@@ -2385,7 +2359,7 @@
                 <w:sz w:val="20"/>
                 <w:szCs w:val="20"/>
               </w:rPr>
-              <w:t xml:space="preserve">Corner</w:t>
+              <w:t xml:space="preserve">Action</w:t>
             </w:r>
           </w:p>
         </w:tc>
@@ -2402,99 +2376,121 @@
                 <w:sz w:val="20"/>
                 <w:szCs w:val="20"/>
               </w:rPr>
-              <w:t xml:space="preserve">Content</w:t>
-            </w:r>
-          </w:p>
-        </w:tc>
-      </w:tr>
-      <w:tr>
-        <w:tc>
-          <w:tcPr>
-            <w:tcW w:w="2700" w:type="dxa"/>
-          </w:tcPr>
-          <w:p>
-            <w:r>
-              <w:t xml:space="preserve">Top-left</w:t>
-            </w:r>
-          </w:p>
-        </w:tc>
-        <w:tc>
-          <w:tcPr>
-            <w:tcW w:w="6300" w:type="dxa"/>
-          </w:tcPr>
-          <w:p>
-            <w:r>
-              <w:t xml:space="preserve">Patient name, MRN, date of birth, sex and age</w:t>
-            </w:r>
-          </w:p>
-        </w:tc>
-      </w:tr>
-      <w:tr>
-        <w:tc>
-          <w:tcPr>
-            <w:tcW w:w="2700" w:type="dxa"/>
-            <w:shd w:val="clear" w:color="auto" w:fill="F5F5F5"/>
-          </w:tcPr>
-          <w:p>
-            <w:r>
-              <w:t xml:space="preserve">Top-right (right-aligned)</w:t>
-            </w:r>
-          </w:p>
-        </w:tc>
-        <w:tc>
-          <w:tcPr>
-            <w:tcW w:w="6300" w:type="dxa"/>
-            <w:shd w:val="clear" w:color="auto" w:fill="F5F5F5"/>
-          </w:tcPr>
-          <w:p>
-            <w:r>
-              <w:t xml:space="preserve">Institution, study date/time, accession number, study description, referring physician</w:t>
-            </w:r>
-          </w:p>
-        </w:tc>
-      </w:tr>
-      <w:tr>
-        <w:tc>
-          <w:tcPr>
-            <w:tcW w:w="2700" w:type="dxa"/>
-          </w:tcPr>
-          <w:p>
-            <w:r>
-              <w:t xml:space="preserve">Bottom-left</w:t>
-            </w:r>
-          </w:p>
-        </w:tc>
-        <w:tc>
-          <w:tcPr>
-            <w:tcW w:w="6300" w:type="dxa"/>
-          </w:tcPr>
-          <w:p>
-            <w:r>
-              <w:t xml:space="preserve">Modality, series number and description, slice thickness, protocol</w:t>
-            </w:r>
-          </w:p>
-        </w:tc>
-      </w:tr>
-      <w:tr>
-        <w:tc>
-          <w:tcPr>
-            <w:tcW w:w="2700" w:type="dxa"/>
-            <w:shd w:val="clear" w:color="auto" w:fill="F5F5F5"/>
-          </w:tcPr>
-          <w:p>
-            <w:r>
-              <w:t xml:space="preserve">Bottom-right (right-aligned)</w:t>
-            </w:r>
-          </w:p>
-        </w:tc>
-        <w:tc>
-          <w:tcPr>
-            <w:tcW w:w="6300" w:type="dxa"/>
-            <w:shd w:val="clear" w:color="auto" w:fill="F5F5F5"/>
-          </w:tcPr>
-          <w:p>
-            <w:r>
-              <w:t xml:space="preserve">Instance number / total, slice location, pixel spacing, W/L values</w:t>
+              <w:t xml:space="preserve">Effect</w:t>
+            </w:r>
+          </w:p>
+        </w:tc>
+      </w:tr>
+      <w:tr>
+        <w:tc>
+          <w:tcPr>
+            <w:tcW w:w="2700" w:type="dxa"/>
+          </w:tcPr>
+          <w:p>
+            <w:r>
+              <w:t xml:space="preserve">Left-drag</w:t>
+            </w:r>
+          </w:p>
+        </w:tc>
+        <w:tc>
+          <w:tcPr>
+            <w:tcW w:w="6300" w:type="dxa"/>
+          </w:tcPr>
+          <w:p>
+            <w:r>
+              <w:t xml:space="preserve">Adjust window/level — horizontal changes the window width, vertical changes the level (centre). The adjustment is anchored to the point where the drag began.</w:t>
+            </w:r>
+          </w:p>
+        </w:tc>
+      </w:tr>
+      <w:tr>
+        <w:tc>
+          <w:tcPr>
+            <w:tcW w:w="2700" w:type="dxa"/>
+            <w:shd w:val="clear" w:color="auto" w:fill="F5F5F5"/>
+          </w:tcPr>
+          <w:p>
+            <w:r>
+              <w:t xml:space="preserve">Right-drag</w:t>
+            </w:r>
+          </w:p>
+        </w:tc>
+        <w:tc>
+          <w:tcPr>
+            <w:tcW w:w="6300" w:type="dxa"/>
+            <w:shd w:val="clear" w:color="auto" w:fill="F5F5F5"/>
+          </w:tcPr>
+          <w:p>
+            <w:r>
+              <w:t xml:space="preserve">Zoom — drag up to magnify, down to zoom out (up to 16×).</w:t>
+            </w:r>
+          </w:p>
+        </w:tc>
+      </w:tr>
+      <w:tr>
+        <w:tc>
+          <w:tcPr>
+            <w:tcW w:w="2700" w:type="dxa"/>
+          </w:tcPr>
+          <w:p>
+            <w:r>
+              <w:t xml:space="preserve">Middle-drag</w:t>
+            </w:r>
+          </w:p>
+        </w:tc>
+        <w:tc>
+          <w:tcPr>
+            <w:tcW w:w="6300" w:type="dxa"/>
+          </w:tcPr>
+          <w:p>
+            <w:r>
+              <w:t xml:space="preserve">Pan the image when zoomed in.</w:t>
+            </w:r>
+          </w:p>
+        </w:tc>
+      </w:tr>
+      <w:tr>
+        <w:tc>
+          <w:tcPr>
+            <w:tcW w:w="2700" w:type="dxa"/>
+            <w:shd w:val="clear" w:color="auto" w:fill="F5F5F5"/>
+          </w:tcPr>
+          <w:p>
+            <w:r>
+              <w:t xml:space="preserve">Mouse wheel</w:t>
+            </w:r>
+          </w:p>
+        </w:tc>
+        <w:tc>
+          <w:tcPr>
+            <w:tcW w:w="6300" w:type="dxa"/>
+            <w:shd w:val="clear" w:color="auto" w:fill="F5F5F5"/>
+          </w:tcPr>
+          <w:p>
+            <w:r>
+              <w:t xml:space="preserve">Step to the previous / next slice in the series.</w:t>
+            </w:r>
+          </w:p>
+        </w:tc>
+      </w:tr>
+      <w:tr>
+        <w:tc>
+          <w:tcPr>
+            <w:tcW w:w="2700" w:type="dxa"/>
+          </w:tcPr>
+          <w:p>
+            <w:r>
+              <w:t xml:space="preserve">Double-click</w:t>
+            </w:r>
+          </w:p>
+        </w:tc>
+        <w:tc>
+          <w:tcPr>
+            <w:tcW w:w="6300" w:type="dxa"/>
+          </w:tcPr>
+          <w:p>
+            <w:r>
+              <w:t xml:space="preserve">Reset zoom and pan to fit the window.</w:t>
             </w:r>
           </w:p>
         </w:tc>
@@ -2503,69 +2499,7 @@
     <w:p/>
     <w:p>
       <w:r>
-        <w:t xml:space="preserve">Anatomical orientation markers (R/L, A/P, H/F) are centred on the four image edges and derived from the ImageOrientationPatient direction cosines in DICOM LPS patient coordinates.</w:t>
-      </w:r>
-    </w:p>
-    <w:p>
-      <w:r>
-        <w:t xml:space="preserve">The Annotations checkbox state persists between sessions.</w:t>
-      </w:r>
-    </w:p>
-    <w:p>
-      <w:pPr>
-        <w:pStyle w:val="Heading2"/>
-      </w:pPr>
-      <w:r>
-        <w:t>8.4  Opening in External Viewer</w:t>
-      </w:r>
-    </w:p>
-    <w:p>
-      <w:r>
-        <w:t xml:space="preserve">The Open in Viewer button in the bottom bar and the right-click menu item open the node's folder in the configured external DICOM viewer. These controls are disabled when no viewer path is configured in Preferences. Open folder opens the folder in Windows Explorer instead.</w:t>
-      </w:r>
-    </w:p>
-    <w:p>
-      <w:pPr>
-        <w:pStyle w:val="Heading2"/>
-      </w:pPr>
-      <w:r>
-        <w:t>8.5  Pushing to a PACS</w:t>
-      </w:r>
-    </w:p>
-    <w:p>
-      <w:r>
-        <w:t xml:space="preserve">Right-click any node and select Push to PACS…, or select items and click Push Selected…, to send files to a remote PACS via C-STORE SCU.</w:t>
-      </w:r>
-    </w:p>
-    <w:p>
-      <w:r>
-        <w:t xml:space="preserve">A dialog appears with a destination selector (any configured server profile), a progress bar and per-file counter, and a Cancel button. The push creates a new association per operation and does not require the PACS tab to be connected.</w:t>
-      </w:r>
-    </w:p>
-    <w:p>
-      <w:pPr>
-        <w:pStyle w:val="Heading2"/>
-      </w:pPr>
-      <w:r>
-        <w:t>8.6  Deleting Local Files</w:t>
-      </w:r>
-    </w:p>
-    <w:p>
-      <w:r>
-        <w:t xml:space="preserve">Right-click any node and select Delete…, or select items and click Delete Selected…, to permanently remove files from disk. A confirmation dialog shows the file count and total size. After deletion, empty directories are pruned and the tree is rescanned automatically.</w:t>
-      </w:r>
-    </w:p>
-    <w:p>
-      <w:r>
-        <w:t xml:space="preserve">Warning: Deletion is permanent. Files are not moved to the Recycle Bin.</w:t>
-      </w:r>
-    </w:p>
-    <w:p>
-      <w:pPr>
-        <w:pStyle w:val="Heading2"/>
-      </w:pPr>
-      <w:r>
-        <w:t>8.7  Selection Controls</w:t>
+        <w:t xml:space="preserve">Keyboard controls (while the viewer window is focused):</w:t>
       </w:r>
     </w:p>
     <w:tbl>
@@ -2604,7 +2538,7 @@
                 <w:sz w:val="20"/>
                 <w:szCs w:val="20"/>
               </w:rPr>
-              <w:t xml:space="preserve">Control</w:t>
+              <w:t xml:space="preserve">Key</w:t>
             </w:r>
           </w:p>
         </w:tc>
@@ -2621,99 +2555,139 @@
                 <w:sz w:val="20"/>
                 <w:szCs w:val="20"/>
               </w:rPr>
-              <w:t xml:space="preserve">Action</w:t>
-            </w:r>
-          </w:p>
-        </w:tc>
-      </w:tr>
-      <w:tr>
-        <w:tc>
-          <w:tcPr>
-            <w:tcW w:w="2700" w:type="dxa"/>
-          </w:tcPr>
-          <w:p>
-            <w:r>
-              <w:t xml:space="preserve">Select All</w:t>
-            </w:r>
-          </w:p>
-        </w:tc>
-        <w:tc>
-          <w:tcPr>
-            <w:tcW w:w="6300" w:type="dxa"/>
-          </w:tcPr>
-          <w:p>
-            <w:r>
-              <w:t xml:space="preserve">Selects every currently visible (filtered) root node and all its descendants.</w:t>
-            </w:r>
-          </w:p>
-        </w:tc>
-      </w:tr>
-      <w:tr>
-        <w:tc>
-          <w:tcPr>
-            <w:tcW w:w="2700" w:type="dxa"/>
-            <w:shd w:val="clear" w:color="auto" w:fill="F5F5F5"/>
-          </w:tcPr>
-          <w:p>
-            <w:r>
-              <w:t xml:space="preserve">Clear Selection</w:t>
-            </w:r>
-          </w:p>
-        </w:tc>
-        <w:tc>
-          <w:tcPr>
-            <w:tcW w:w="6300" w:type="dxa"/>
-            <w:shd w:val="clear" w:color="auto" w:fill="F5F5F5"/>
-          </w:tcPr>
-          <w:p>
-            <w:r>
-              <w:t xml:space="preserve">Deselects everything.</w:t>
-            </w:r>
-          </w:p>
-        </w:tc>
-      </w:tr>
-      <w:tr>
-        <w:tc>
-          <w:tcPr>
-            <w:tcW w:w="2700" w:type="dxa"/>
-          </w:tcPr>
-          <w:p>
-            <w:r>
-              <w:t xml:space="preserve">Push Selected…</w:t>
-            </w:r>
-          </w:p>
-        </w:tc>
-        <w:tc>
-          <w:tcPr>
-            <w:tcW w:w="6300" w:type="dxa"/>
-          </w:tcPr>
-          <w:p>
-            <w:r>
-              <w:t xml:space="preserve">Pushes all selected files to a chosen server.</w:t>
-            </w:r>
-          </w:p>
-        </w:tc>
-      </w:tr>
-      <w:tr>
-        <w:tc>
-          <w:tcPr>
-            <w:tcW w:w="2700" w:type="dxa"/>
-            <w:shd w:val="clear" w:color="auto" w:fill="F5F5F5"/>
-          </w:tcPr>
-          <w:p>
-            <w:r>
-              <w:t xml:space="preserve">Delete Selected…</w:t>
-            </w:r>
-          </w:p>
-        </w:tc>
-        <w:tc>
-          <w:tcPr>
-            <w:tcW w:w="6300" w:type="dxa"/>
-            <w:shd w:val="clear" w:color="auto" w:fill="F5F5F5"/>
-          </w:tcPr>
-          <w:p>
-            <w:r>
-              <w:t xml:space="preserve">Deletes all selected files after confirmation.</w:t>
+              <w:t xml:space="preserve">Effect</w:t>
+            </w:r>
+          </w:p>
+        </w:tc>
+      </w:tr>
+      <w:tr>
+        <w:tc>
+          <w:tcPr>
+            <w:tcW w:w="2700" w:type="dxa"/>
+          </w:tcPr>
+          <w:p>
+            <w:r>
+              <w:t xml:space="preserve">Up / Left / Page Up</w:t>
+            </w:r>
+          </w:p>
+        </w:tc>
+        <w:tc>
+          <w:tcPr>
+            <w:tcW w:w="6300" w:type="dxa"/>
+          </w:tcPr>
+          <w:p>
+            <w:r>
+              <w:t xml:space="preserve">Previous slice.</w:t>
+            </w:r>
+          </w:p>
+        </w:tc>
+      </w:tr>
+      <w:tr>
+        <w:tc>
+          <w:tcPr>
+            <w:tcW w:w="2700" w:type="dxa"/>
+            <w:shd w:val="clear" w:color="auto" w:fill="F5F5F5"/>
+          </w:tcPr>
+          <w:p>
+            <w:r>
+              <w:t xml:space="preserve">Down / Right / Page Down</w:t>
+            </w:r>
+          </w:p>
+        </w:tc>
+        <w:tc>
+          <w:tcPr>
+            <w:tcW w:w="6300" w:type="dxa"/>
+            <w:shd w:val="clear" w:color="auto" w:fill="F5F5F5"/>
+          </w:tcPr>
+          <w:p>
+            <w:r>
+              <w:t xml:space="preserve">Next slice.</w:t>
+            </w:r>
+          </w:p>
+        </w:tc>
+      </w:tr>
+      <w:tr>
+        <w:tc>
+          <w:tcPr>
+            <w:tcW w:w="2700" w:type="dxa"/>
+          </w:tcPr>
+          <w:p>
+            <w:r>
+              <w:rPr>
+                <w:rFonts w:ascii="Courier New" w:hAnsi="Courier New"/>
+                <w:sz w:val="18"/>
+                <w:szCs w:val="18"/>
+                <w:shd w:val="clear" w:color="auto" w:fill="EBEBEB"/>
+              </w:rPr>
+              <w:t xml:space="preserve">+</w:t>
+            </w:r>
+            <w:r>
+              <w:t xml:space="preserve"> / </w:t>
+            </w:r>
+            <w:r>
+              <w:rPr>
+                <w:rFonts w:ascii="Courier New" w:hAnsi="Courier New"/>
+                <w:sz w:val="18"/>
+                <w:szCs w:val="18"/>
+                <w:shd w:val="clear" w:color="auto" w:fill="EBEBEB"/>
+              </w:rPr>
+              <w:t xml:space="preserve">-</w:t>
+            </w:r>
+          </w:p>
+        </w:tc>
+        <w:tc>
+          <w:tcPr>
+            <w:tcW w:w="6300" w:type="dxa"/>
+          </w:tcPr>
+          <w:p>
+            <w:r>
+              <w:t xml:space="preserve">Zoom in / out.</w:t>
+            </w:r>
+          </w:p>
+        </w:tc>
+      </w:tr>
+      <w:tr>
+        <w:tc>
+          <w:tcPr>
+            <w:tcW w:w="2700" w:type="dxa"/>
+            <w:shd w:val="clear" w:color="auto" w:fill="F5F5F5"/>
+          </w:tcPr>
+          <w:p>
+            <w:r>
+              <w:t xml:space="preserve">Home or F</w:t>
+            </w:r>
+          </w:p>
+        </w:tc>
+        <w:tc>
+          <w:tcPr>
+            <w:tcW w:w="6300" w:type="dxa"/>
+            <w:shd w:val="clear" w:color="auto" w:fill="F5F5F5"/>
+          </w:tcPr>
+          <w:p>
+            <w:r>
+              <w:t xml:space="preserve">Reset zoom and pan to fit.</w:t>
+            </w:r>
+          </w:p>
+        </w:tc>
+      </w:tr>
+      <w:tr>
+        <w:tc>
+          <w:tcPr>
+            <w:tcW w:w="2700" w:type="dxa"/>
+          </w:tcPr>
+          <w:p>
+            <w:r>
+              <w:t xml:space="preserve">R</w:t>
+            </w:r>
+          </w:p>
+        </w:tc>
+        <w:tc>
+          <w:tcPr>
+            <w:tcW w:w="6300" w:type="dxa"/>
+          </w:tcPr>
+          <w:p>
+            <w:r>
+              <w:t xml:space="preserve">Reset the window to the default (clears any preset or manual adjustment).</w:t>
             </w:r>
           </w:p>
         </w:tc>
@@ -2721,86 +2695,26 @@
     </w:tbl>
     <w:p/>
     <w:p>
-      <w:pPr>
-        <w:pStyle w:val="Heading1"/>
-      </w:pPr>
-      <w:r>
-        <w:t>9  Import Tab</w:t>
-      </w:r>
-    </w:p>
-    <w:p>
-      <w:r>
-        <w:t xml:space="preserve">The Import tab copies DICOM files from any folder into the organised download folder, applying the same Patient / Study / Series subfolder structure used by retrieval.</w:t>
-      </w:r>
-    </w:p>
-    <w:p>
-      <w:pPr>
-        <w:pStyle w:val="Heading2"/>
-      </w:pPr>
-      <w:r>
-        <w:t>9.1  Scanning a Source Folder</w:t>
-      </w:r>
-    </w:p>
-    <w:p>
-      <w:r>
-        <w:t xml:space="preserve">Enter or browse to a source folder and click Scan. dicomqr walks the folder and builds a tree of studies and series found in it. The destination folder (the configured download folder) is shown read-only below the source field.</w:t>
-      </w:r>
-    </w:p>
-    <w:p>
-      <w:pPr>
-        <w:pStyle w:val="Heading2"/>
-      </w:pPr>
-      <w:r>
-        <w:t>9.2  Selecting and Importing</w:t>
-      </w:r>
-    </w:p>
-    <w:p>
-      <w:r>
-        <w:t xml:space="preserve">Click rows in the tree to select them. Click Import Selected to copy the selected files. Files already present in the destination (same SOP Instance UID at the same destination path) are skipped; the status label reports imported, already-present, and failed counts.</w:t>
-      </w:r>
-    </w:p>
-    <w:p>
-      <w:r>
-        <w:t xml:space="preserve">Select All and Clear Selection buttons are provided. The filter bar narrows the tree in the same way as the other tabs.</w:t>
-      </w:r>
-    </w:p>
-    <w:p>
-      <w:pPr>
-        <w:pStyle w:val="Heading1"/>
-      </w:pPr>
-      <w:r>
-        <w:t>10  Worklist Tab</w:t>
-      </w:r>
-    </w:p>
-    <w:p>
-      <w:r>
-        <w:t xml:space="preserve">The Worklist tab queries a Modality Worklist server for scheduled imaging procedures. It operates independently of the PACS Query tab — it does not require a PACS connection and can target a different server (typically a RIS or MWL broker).</w:t>
-      </w:r>
-    </w:p>
-    <w:p>
-      <w:pPr>
-        <w:pStyle w:val="Heading2"/>
-      </w:pPr>
-      <w:r>
-        <w:t>10.1  Selecting a Worklist Server</w:t>
-      </w:r>
-    </w:p>
-    <w:p>
-      <w:r>
-        <w:t xml:space="preserve">Choose any configured server profile from the Worklist server dropdown. The dropdown updates when server profiles are added or removed in Preferences. The query connects to the selected profile's host, port, and AE Title for each query and releases the association immediately after.</w:t>
-      </w:r>
-    </w:p>
-    <w:p>
-      <w:r>
-        <w:t xml:space="preserve">Note: the Modality Worklist SOP class (1.2.840.10008.5.1.4.31) must be enabled on the target server. In most environments this is a separate system from the PACS — configure a server profile pointing to that system.</w:t>
-      </w:r>
-    </w:p>
-    <w:p>
-      <w:pPr>
-        <w:pStyle w:val="Heading2"/>
-      </w:pPr>
-      <w:r>
-        <w:t>10.2  Query Fields</w:t>
+      <w:r>
+        <w:t xml:space="preserve">The Reset button resets both the view (zoom/pan) and the window to the default. Window/level changes made by dragging or by selecting a preset persist as you scroll through the series.</w:t>
+      </w:r>
+    </w:p>
+    <w:p>
+      <w:r>
+        <w:t xml:space="preserve">Compressed pixel data — the built-in viewer decodes JPEG Baseline and uncompressed (native) pixel data. Files stored in JPEG 2000, JPEG-LS, JPEG Lossless, or RLE Lossless formats cannot be decoded and display a message explaining the limitation with a suggestion to use Open in Viewer. To avoid this, enable 'Request uncompressed transfer syntax only' in the server profile before retrieving (see Section 4.1).</w:t>
+      </w:r>
+    </w:p>
+    <w:p>
+      <w:pPr>
+        <w:pStyle w:val="Heading3"/>
+      </w:pPr>
+      <w:r>
+        <w:t>8.3.2  Window/Level Presets</w:t>
+      </w:r>
+    </w:p>
+    <w:p>
+      <w:r>
+        <w:t xml:space="preserve">The Window dropdown in the viewer bottom bar offers preset windows tailored to the image's modality. Selecting a preset applies it to the current slice and to subsequent slices until you adjust the window manually. Default restores the image's own window (from the DICOM Window tags, or an automatic 1st–99th percentile window when absent); Full range maps the entire pixel value range.</w:t>
       </w:r>
     </w:p>
     <w:tbl>
@@ -2839,7 +2753,7 @@
                 <w:sz w:val="20"/>
                 <w:szCs w:val="20"/>
               </w:rPr>
-              <w:t xml:space="preserve">Field</w:t>
+              <w:t xml:space="preserve">Modality</w:t>
             </w:r>
           </w:p>
         </w:tc>
@@ -2856,133 +2770,99 @@
                 <w:sz w:val="20"/>
                 <w:szCs w:val="20"/>
               </w:rPr>
-              <w:t xml:space="preserve">Description</w:t>
-            </w:r>
-          </w:p>
-        </w:tc>
-      </w:tr>
-      <w:tr>
-        <w:tc>
-          <w:tcPr>
-            <w:tcW w:w="2700" w:type="dxa"/>
-          </w:tcPr>
-          <w:p>
-            <w:r>
-              <w:t xml:space="preserve">Patient Name</w:t>
-            </w:r>
-          </w:p>
-        </w:tc>
-        <w:tc>
-          <w:tcPr>
-            <w:tcW w:w="6300" w:type="dxa"/>
-          </w:tcPr>
-          <w:p>
-            <w:r>
-              <w:t xml:space="preserve">Wildcard-capable patient name match. A trailing </w:t>
-            </w:r>
-            <w:r>
-              <w:rPr>
-                <w:rFonts w:ascii="Courier New" w:hAnsi="Courier New"/>
-                <w:sz w:val="18"/>
-                <w:szCs w:val="18"/>
-                <w:shd w:val="clear" w:color="auto" w:fill="EBEBEB"/>
-              </w:rPr>
-              <w:t xml:space="preserve">*</w:t>
-            </w:r>
-            <w:r>
-              <w:t xml:space="preserve"> is appended automatically. Leave blank to match all patients.</w:t>
-            </w:r>
-          </w:p>
-        </w:tc>
-      </w:tr>
-      <w:tr>
-        <w:tc>
-          <w:tcPr>
-            <w:tcW w:w="2700" w:type="dxa"/>
-            <w:shd w:val="clear" w:color="auto" w:fill="F5F5F5"/>
-          </w:tcPr>
-          <w:p>
-            <w:r>
-              <w:t xml:space="preserve">MRN</w:t>
-            </w:r>
-          </w:p>
-        </w:tc>
-        <w:tc>
-          <w:tcPr>
-            <w:tcW w:w="6300" w:type="dxa"/>
-            <w:shd w:val="clear" w:color="auto" w:fill="F5F5F5"/>
-          </w:tcPr>
-          <w:p>
-            <w:r>
-              <w:t xml:space="preserve">Wildcard-capable Patient ID match.</w:t>
-            </w:r>
-          </w:p>
-        </w:tc>
-      </w:tr>
-      <w:tr>
-        <w:tc>
-          <w:tcPr>
-            <w:tcW w:w="2700" w:type="dxa"/>
-          </w:tcPr>
-          <w:p>
-            <w:r>
-              <w:t xml:space="preserve">Accession</w:t>
-            </w:r>
-          </w:p>
-        </w:tc>
-        <w:tc>
-          <w:tcPr>
-            <w:tcW w:w="6300" w:type="dxa"/>
-          </w:tcPr>
-          <w:p>
-            <w:r>
-              <w:t xml:space="preserve">Wildcard-capable Accession Number match.</w:t>
-            </w:r>
-          </w:p>
-        </w:tc>
-      </w:tr>
-      <w:tr>
-        <w:tc>
-          <w:tcPr>
-            <w:tcW w:w="2700" w:type="dxa"/>
-            <w:shd w:val="clear" w:color="auto" w:fill="F5F5F5"/>
-          </w:tcPr>
-          <w:p>
-            <w:r>
-              <w:t xml:space="preserve">Modality</w:t>
-            </w:r>
-          </w:p>
-        </w:tc>
-        <w:tc>
-          <w:tcPr>
-            <w:tcW w:w="6300" w:type="dxa"/>
-            <w:shd w:val="clear" w:color="auto" w:fill="F5F5F5"/>
-          </w:tcPr>
-          <w:p>
-            <w:r>
-              <w:t xml:space="preserve">Restricts results to one modality. Select (any) to include all modalities.</w:t>
-            </w:r>
-          </w:p>
-        </w:tc>
-      </w:tr>
-      <w:tr>
-        <w:tc>
-          <w:tcPr>
-            <w:tcW w:w="2700" w:type="dxa"/>
-          </w:tcPr>
-          <w:p>
-            <w:r>
-              <w:t xml:space="preserve">Scheduled date</w:t>
-            </w:r>
-          </w:p>
-        </w:tc>
-        <w:tc>
-          <w:tcPr>
-            <w:tcW w:w="6300" w:type="dxa"/>
-          </w:tcPr>
-          <w:p>
-            <w:r>
-              <w:t xml:space="preserve">Today only (checked by default) — restricts to today's scheduled date. Uncheck to select a specific date using the calendar picker. Leave blank (unchecked, no date selected) to return all scheduled dates.</w:t>
+              <w:t xml:space="preserve">Presets offered</w:t>
+            </w:r>
+          </w:p>
+        </w:tc>
+      </w:tr>
+      <w:tr>
+        <w:tc>
+          <w:tcPr>
+            <w:tcW w:w="2700" w:type="dxa"/>
+          </w:tcPr>
+          <w:p>
+            <w:r>
+              <w:t xml:space="preserve">CT</w:t>
+            </w:r>
+          </w:p>
+        </w:tc>
+        <w:tc>
+          <w:tcPr>
+            <w:tcW w:w="6300" w:type="dxa"/>
+          </w:tcPr>
+          <w:p>
+            <w:r>
+              <w:t xml:space="preserve">Default, Full range, plus Hounsfield windows: Brain, Subdural, Soft tissue, Liver, Mediastinum, Bone, Lung.</w:t>
+            </w:r>
+          </w:p>
+        </w:tc>
+      </w:tr>
+      <w:tr>
+        <w:tc>
+          <w:tcPr>
+            <w:tcW w:w="2700" w:type="dxa"/>
+            <w:shd w:val="clear" w:color="auto" w:fill="F5F5F5"/>
+          </w:tcPr>
+          <w:p>
+            <w:r>
+              <w:t xml:space="preserve">PET (PT)</w:t>
+            </w:r>
+          </w:p>
+        </w:tc>
+        <w:tc>
+          <w:tcPr>
+            <w:tcW w:w="6300" w:type="dxa"/>
+            <w:shd w:val="clear" w:color="auto" w:fill="F5F5F5"/>
+          </w:tcPr>
+          <w:p>
+            <w:r>
+              <w:t xml:space="preserve">Default, Full range, plus 0 → 75% / 50% / 40% / 30% / 20% windows expressed as a fraction of the peak value (a lower percentage raises contrast in low-uptake regions).</w:t>
+            </w:r>
+          </w:p>
+        </w:tc>
+      </w:tr>
+      <w:tr>
+        <w:tc>
+          <w:tcPr>
+            <w:tcW w:w="2700" w:type="dxa"/>
+          </w:tcPr>
+          <w:p>
+            <w:r>
+              <w:t xml:space="preserve">MR</w:t>
+            </w:r>
+          </w:p>
+        </w:tc>
+        <w:tc>
+          <w:tcPr>
+            <w:tcW w:w="6300" w:type="dxa"/>
+          </w:tcPr>
+          <w:p>
+            <w:r>
+              <w:t xml:space="preserve">Default, Full range, plus Lower / Higher / Highest contrast windows scaled relative to the image's own window (MR intensities have no absolute scale).</w:t>
+            </w:r>
+          </w:p>
+        </w:tc>
+      </w:tr>
+      <w:tr>
+        <w:tc>
+          <w:tcPr>
+            <w:tcW w:w="2700" w:type="dxa"/>
+            <w:shd w:val="clear" w:color="auto" w:fill="F5F5F5"/>
+          </w:tcPr>
+          <w:p>
+            <w:r>
+              <w:t xml:space="preserve">Other</w:t>
+            </w:r>
+          </w:p>
+        </w:tc>
+        <w:tc>
+          <w:tcPr>
+            <w:tcW w:w="6300" w:type="dxa"/>
+            <w:shd w:val="clear" w:color="auto" w:fill="F5F5F5"/>
+          </w:tcPr>
+          <w:p>
+            <w:r>
+              <w:t xml:space="preserve">Default, Full range, Lower contrast, Higher contrast.</w:t>
             </w:r>
           </w:p>
         </w:tc>
@@ -2990,182 +2870,29 @@
     </w:tbl>
     <w:p/>
     <w:p>
-      <w:r>
-        <w:t xml:space="preserve">Click Query Worklist or press Enter in any text field to run the query. Click Clear to reset all fields and clear the results.</w:t>
-      </w:r>
-    </w:p>
-    <w:p>
-      <w:pPr>
-        <w:pStyle w:val="Heading2"/>
-      </w:pPr>
-      <w:r>
-        <w:t>10.3  Results Table</w:t>
-      </w:r>
-    </w:p>
-    <w:p>
-      <w:r>
-        <w:t xml:space="preserve">Results are shown in a table with columns: Patient, MRN, Accession, Date, Time, Modality, Procedure, and Station. Click any row to select it.</w:t>
-      </w:r>
-    </w:p>
-    <w:p>
-      <w:r>
-        <w:t xml:space="preserve">Copy Accession and Copy Patient buttons copy the selected row's values to the clipboard. The status label shows the number of worklist items returned, or any error message.</w:t>
-      </w:r>
-    </w:p>
-    <w:p>
-      <w:pPr>
-        <w:pStyle w:val="Heading2"/>
-      </w:pPr>
-      <w:r>
-        <w:t>10.4  Typical Use Cases</w:t>
-      </w:r>
-    </w:p>
-    <w:p>
-      <w:pPr>
-        <w:pStyle w:val="ListBullet"/>
-      </w:pPr>
-      <w:r>
-        <w:t xml:space="preserve">Verify a scheduled procedure — query by patient name or accession to confirm an order reached the worklist server before the patient arrives at the scanner.</w:t>
-      </w:r>
-    </w:p>
-    <w:p>
-      <w:pPr>
-        <w:pStyle w:val="ListBullet"/>
-      </w:pPr>
-      <w:r>
-        <w:t xml:space="preserve">Diagnose "patient not on scanner" — if a technologist cannot find a patient on the modality's worklist, query here; if the entry appears, the problem is in the scanner's MWL configuration; if it does not, the order was not transmitted to the worklist server.</w:t>
-      </w:r>
-    </w:p>
-    <w:p>
-      <w:pPr>
-        <w:pStyle w:val="ListBullet"/>
-      </w:pPr>
-      <w:r>
-        <w:t xml:space="preserve">Look up an accession number — copy the accession and switch to PACS Query to search for the matching study.</w:t>
-      </w:r>
-    </w:p>
-    <w:p>
-      <w:pPr>
-        <w:pStyle w:val="Heading1"/>
-      </w:pPr>
-      <w:r>
-        <w:t>11  Downloaded Files</w:t>
-      </w:r>
-    </w:p>
-    <w:p>
-      <w:r>
-        <w:t xml:space="preserve">Files are written to the folder specified in the Download to field. Within that folder, dicomqr creates a three-level subfolder structure:</w:t>
-      </w:r>
-    </w:p>
-    <w:p>
-      <w:pPr>
-        <w:pStyle w:val="Code"/>
-      </w:pPr>
-      <w:r>
-        <w:t xml:space="preserve">&lt;Download folder&gt;\</w:t>
-      </w:r>
-    </w:p>
-    <w:p>
-      <w:pPr>
-        <w:pStyle w:val="Code"/>
-      </w:pPr>
-      <w:r>
-        <w:t xml:space="preserve">    &lt;Patient Name&gt; (&lt;Patient ID&gt;)\</w:t>
-      </w:r>
-    </w:p>
-    <w:p>
-      <w:pPr>
-        <w:pStyle w:val="Code"/>
-      </w:pPr>
-      <w:r>
-        <w:t xml:space="preserve">        &lt;Study Description&gt; (&lt;Study Date&gt;)\</w:t>
-      </w:r>
-    </w:p>
-    <w:p>
-      <w:pPr>
-        <w:pStyle w:val="Code"/>
-      </w:pPr>
-      <w:r>
-        <w:t xml:space="preserve">            &lt;Series Description&gt; (&lt;Series Number&gt;)\</w:t>
-      </w:r>
-    </w:p>
-    <w:p>
-      <w:pPr>
-        <w:pStyle w:val="Code"/>
-      </w:pPr>
-      <w:r>
-        <w:t xml:space="preserve">                &lt;SOP Instance UID&gt;.dcm</w:t>
-      </w:r>
-    </w:p>
-    <w:p>
-      <w:r>
-        <w:t xml:space="preserve">For example:</w:t>
-      </w:r>
-    </w:p>
-    <w:p>
-      <w:pPr>
-        <w:pStyle w:val="Code"/>
-      </w:pPr>
-      <w:r>
-        <w:t xml:space="preserve">Downloads\</w:t>
-      </w:r>
-    </w:p>
-    <w:p>
-      <w:pPr>
-        <w:pStyle w:val="Code"/>
-      </w:pPr>
-      <w:r>
-        <w:t xml:space="preserve">    Doe^John (MRN12345)\</w:t>
-      </w:r>
-    </w:p>
-    <w:p>
-      <w:pPr>
-        <w:pStyle w:val="Code"/>
-      </w:pPr>
-      <w:r>
-        <w:t xml:space="preserve">        Chest CT (20240115)\</w:t>
-      </w:r>
-    </w:p>
-    <w:p>
-      <w:pPr>
-        <w:pStyle w:val="Code"/>
-      </w:pPr>
-      <w:r>
-        <w:t xml:space="preserve">            Chest W Contrast (2)\</w:t>
-      </w:r>
-    </w:p>
-    <w:p>
-      <w:pPr>
-        <w:pStyle w:val="Code"/>
-      </w:pPr>
-      <w:r>
-        <w:t xml:space="preserve">                1.2.840.10008.5.1.4.1.1.2.dcm</w:t>
-      </w:r>
-    </w:p>
-    <w:p>
-      <w:r>
-        <w:t xml:space="preserve">If a metadata field is absent from the DICOM file, the corresponding folder component falls back to a descriptive placeholder: Unknown Patient, Unknown Study, or Unknown Series. Characters that are not permitted in Windows file or folder names are replaced with underscores.</w:t>
-      </w:r>
-    </w:p>
-    <w:p>
-      <w:r>
-        <w:t xml:space="preserve">Each SOP Instance UID is unique, so files from different studies that share the same patient ID and series number are written to separate subfolders and are never overwritten.</w:t>
-      </w:r>
-    </w:p>
-    <w:p>
-      <w:pPr>
-        <w:pStyle w:val="Heading1"/>
-      </w:pPr>
-      <w:r>
-        <w:t>12  Menus</w:t>
-      </w:r>
-    </w:p>
-    <w:p>
-      <w:pPr>
-        <w:pStyle w:val="Heading2"/>
-      </w:pPr>
-      <w:r>
-        <w:t>12.1  File Menu</w:t>
+      <w:pPr>
+        <w:pStyle w:val="Heading3"/>
+      </w:pPr>
+      <w:r>
+        <w:t>8.3.3  Study Overview Grid</w:t>
+      </w:r>
+    </w:p>
+    <w:p>
+      <w:r>
+        <w:t xml:space="preserve">The overview window shows one thumbnail per series — the middle slice of each series rendered in parallel. Thumbnails are arranged in a three-column grid. Double-click any thumbnail to open that series in the full series viewer.</w:t>
+      </w:r>
+    </w:p>
+    <w:p>
+      <w:pPr>
+        <w:pStyle w:val="Heading3"/>
+      </w:pPr>
+      <w:r>
+        <w:t>8.3.4  DICOM Annotation Overlay</w:t>
+      </w:r>
+    </w:p>
+    <w:p>
+      <w:r>
+        <w:t xml:space="preserve">When Annotations is checked in the series viewer, a four-corner overlay is drawn within the actual image area (never in the letterbox bars):</w:t>
       </w:r>
     </w:p>
     <w:tbl>
@@ -3204,7 +2931,7 @@
                 <w:sz w:val="20"/>
                 <w:szCs w:val="20"/>
               </w:rPr>
-              <w:t xml:space="preserve">Item</w:t>
+              <w:t xml:space="preserve">Corner</w:t>
             </w:r>
           </w:p>
         </w:tc>
@@ -3221,99 +2948,99 @@
                 <w:sz w:val="20"/>
                 <w:szCs w:val="20"/>
               </w:rPr>
-              <w:t xml:space="preserve">Description</w:t>
-            </w:r>
-          </w:p>
-        </w:tc>
-      </w:tr>
-      <w:tr>
-        <w:tc>
-          <w:tcPr>
-            <w:tcW w:w="2700" w:type="dxa"/>
-          </w:tcPr>
-          <w:p>
-            <w:r>
-              <w:t xml:space="preserve">Connect</w:t>
-            </w:r>
-          </w:p>
-        </w:tc>
-        <w:tc>
-          <w:tcPr>
-            <w:tcW w:w="6300" w:type="dxa"/>
-          </w:tcPr>
-          <w:p>
-            <w:r>
-              <w:t xml:space="preserve">Connects to the currently selected server profile.</w:t>
-            </w:r>
-          </w:p>
-        </w:tc>
-      </w:tr>
-      <w:tr>
-        <w:tc>
-          <w:tcPr>
-            <w:tcW w:w="2700" w:type="dxa"/>
-            <w:shd w:val="clear" w:color="auto" w:fill="F5F5F5"/>
-          </w:tcPr>
-          <w:p>
-            <w:r>
-              <w:t xml:space="preserve">Disconnect</w:t>
-            </w:r>
-          </w:p>
-        </w:tc>
-        <w:tc>
-          <w:tcPr>
-            <w:tcW w:w="6300" w:type="dxa"/>
-            <w:shd w:val="clear" w:color="auto" w:fill="F5F5F5"/>
-          </w:tcPr>
-          <w:p>
-            <w:r>
-              <w:t xml:space="preserve">Ends the current session and stops the local SCP listener.</w:t>
-            </w:r>
-          </w:p>
-        </w:tc>
-      </w:tr>
-      <w:tr>
-        <w:tc>
-          <w:tcPr>
-            <w:tcW w:w="2700" w:type="dxa"/>
-          </w:tcPr>
-          <w:p>
-            <w:r>
-              <w:t xml:space="preserve">Preferences…</w:t>
-            </w:r>
-          </w:p>
-        </w:tc>
-        <w:tc>
-          <w:tcPr>
-            <w:tcW w:w="6300" w:type="dxa"/>
-          </w:tcPr>
-          <w:p>
-            <w:r>
-              <w:t xml:space="preserve">Opens the Preferences dialog. See Section 14.</w:t>
-            </w:r>
-          </w:p>
-        </w:tc>
-      </w:tr>
-      <w:tr>
-        <w:tc>
-          <w:tcPr>
-            <w:tcW w:w="2700" w:type="dxa"/>
-            <w:shd w:val="clear" w:color="auto" w:fill="F5F5F5"/>
-          </w:tcPr>
-          <w:p>
-            <w:r>
-              <w:t xml:space="preserve">Quit</w:t>
-            </w:r>
-          </w:p>
-        </w:tc>
-        <w:tc>
-          <w:tcPr>
-            <w:tcW w:w="6300" w:type="dxa"/>
-            <w:shd w:val="clear" w:color="auto" w:fill="F5F5F5"/>
-          </w:tcPr>
-          <w:p>
-            <w:r>
-              <w:t xml:space="preserve">Exits the application.</w:t>
+              <w:t xml:space="preserve">Content</w:t>
+            </w:r>
+          </w:p>
+        </w:tc>
+      </w:tr>
+      <w:tr>
+        <w:tc>
+          <w:tcPr>
+            <w:tcW w:w="2700" w:type="dxa"/>
+          </w:tcPr>
+          <w:p>
+            <w:r>
+              <w:t xml:space="preserve">Top-left</w:t>
+            </w:r>
+          </w:p>
+        </w:tc>
+        <w:tc>
+          <w:tcPr>
+            <w:tcW w:w="6300" w:type="dxa"/>
+          </w:tcPr>
+          <w:p>
+            <w:r>
+              <w:t xml:space="preserve">Patient name, MRN, date of birth, sex and age</w:t>
+            </w:r>
+          </w:p>
+        </w:tc>
+      </w:tr>
+      <w:tr>
+        <w:tc>
+          <w:tcPr>
+            <w:tcW w:w="2700" w:type="dxa"/>
+            <w:shd w:val="clear" w:color="auto" w:fill="F5F5F5"/>
+          </w:tcPr>
+          <w:p>
+            <w:r>
+              <w:t xml:space="preserve">Top-right (right-aligned)</w:t>
+            </w:r>
+          </w:p>
+        </w:tc>
+        <w:tc>
+          <w:tcPr>
+            <w:tcW w:w="6300" w:type="dxa"/>
+            <w:shd w:val="clear" w:color="auto" w:fill="F5F5F5"/>
+          </w:tcPr>
+          <w:p>
+            <w:r>
+              <w:t xml:space="preserve">Institution, study date/time, accession number, study description, referring physician</w:t>
+            </w:r>
+          </w:p>
+        </w:tc>
+      </w:tr>
+      <w:tr>
+        <w:tc>
+          <w:tcPr>
+            <w:tcW w:w="2700" w:type="dxa"/>
+          </w:tcPr>
+          <w:p>
+            <w:r>
+              <w:t xml:space="preserve">Bottom-left</w:t>
+            </w:r>
+          </w:p>
+        </w:tc>
+        <w:tc>
+          <w:tcPr>
+            <w:tcW w:w="6300" w:type="dxa"/>
+          </w:tcPr>
+          <w:p>
+            <w:r>
+              <w:t xml:space="preserve">Modality, series number and description, slice thickness, protocol</w:t>
+            </w:r>
+          </w:p>
+        </w:tc>
+      </w:tr>
+      <w:tr>
+        <w:tc>
+          <w:tcPr>
+            <w:tcW w:w="2700" w:type="dxa"/>
+            <w:shd w:val="clear" w:color="auto" w:fill="F5F5F5"/>
+          </w:tcPr>
+          <w:p>
+            <w:r>
+              <w:t xml:space="preserve">Bottom-right (right-aligned)</w:t>
+            </w:r>
+          </w:p>
+        </w:tc>
+        <w:tc>
+          <w:tcPr>
+            <w:tcW w:w="6300" w:type="dxa"/>
+            <w:shd w:val="clear" w:color="auto" w:fill="F5F5F5"/>
+          </w:tcPr>
+          <w:p>
+            <w:r>
+              <w:t xml:space="preserve">Instance number / total, slice location, pixel spacing, W/L values</w:t>
             </w:r>
           </w:p>
         </w:tc>
@@ -3321,11 +3048,70 @@
     </w:tbl>
     <w:p/>
     <w:p>
+      <w:r>
+        <w:t xml:space="preserve">Anatomical orientation markers (R/L, A/P, H/F) are centred on the four image edges and derived from the ImageOrientationPatient direction cosines in DICOM LPS patient coordinates.</w:t>
+      </w:r>
+    </w:p>
+    <w:p>
+      <w:r>
+        <w:t xml:space="preserve">The Annotations checkbox state persists between sessions.</w:t>
+      </w:r>
+    </w:p>
+    <w:p>
       <w:pPr>
         <w:pStyle w:val="Heading2"/>
       </w:pPr>
       <w:r>
-        <w:t>12.2  Query Menu</w:t>
+        <w:t>8.4  Opening in External Viewer</w:t>
+      </w:r>
+    </w:p>
+    <w:p>
+      <w:r>
+        <w:t xml:space="preserve">The Open in Viewer button in the bottom bar and the right-click menu item open the node's folder in the configured external DICOM viewer. These controls are disabled when no viewer path is configured in Preferences. Open folder opens the folder in Windows Explorer instead.</w:t>
+      </w:r>
+    </w:p>
+    <w:p>
+      <w:pPr>
+        <w:pStyle w:val="Heading2"/>
+      </w:pPr>
+      <w:r>
+        <w:t>8.5  Pushing to a PACS</w:t>
+      </w:r>
+    </w:p>
+    <w:p>
+      <w:r>
+        <w:t xml:space="preserve">Right-click any node and select Push to PACS…, or select items and click Push Selected…, to send files to a remote PACS via C-STORE SCU.</w:t>
+      </w:r>
+    </w:p>
+    <w:p>
+      <w:r>
+        <w:t xml:space="preserve">A dialog appears with a destination selector (any configured server profile), a progress bar and per-file counter, and a Cancel button. The push creates a new association per operation and does not require the PACS tab to be connected.</w:t>
+      </w:r>
+    </w:p>
+    <w:p>
+      <w:pPr>
+        <w:pStyle w:val="Heading2"/>
+      </w:pPr>
+      <w:r>
+        <w:t>8.6  Deleting Local Files</w:t>
+      </w:r>
+    </w:p>
+    <w:p>
+      <w:r>
+        <w:t xml:space="preserve">Right-click any node and select Delete…, or select items and click Delete Selected…, to permanently remove files from disk. A confirmation dialog shows the file count and total size. After deletion, empty directories are pruned and the tree is rescanned automatically.</w:t>
+      </w:r>
+    </w:p>
+    <w:p>
+      <w:r>
+        <w:t xml:space="preserve">Warning: Deletion is permanent. Files are not moved to the Recycle Bin.</w:t>
+      </w:r>
+    </w:p>
+    <w:p>
+      <w:pPr>
+        <w:pStyle w:val="Heading2"/>
+      </w:pPr>
+      <w:r>
+        <w:t>8.7  Selection Controls</w:t>
       </w:r>
     </w:p>
     <w:tbl>
@@ -3364,7 +3150,7 @@
                 <w:sz w:val="20"/>
                 <w:szCs w:val="20"/>
               </w:rPr>
-              <w:t xml:space="preserve">Item</w:t>
+              <w:t xml:space="preserve">Control</w:t>
             </w:r>
           </w:p>
         </w:tc>
@@ -3381,121 +3167,99 @@
                 <w:sz w:val="20"/>
                 <w:szCs w:val="20"/>
               </w:rPr>
-              <w:t xml:space="preserve">Description</w:t>
-            </w:r>
-          </w:p>
-        </w:tc>
-      </w:tr>
-      <w:tr>
-        <w:tc>
-          <w:tcPr>
-            <w:tcW w:w="2700" w:type="dxa"/>
-          </w:tcPr>
-          <w:p>
-            <w:r>
-              <w:t xml:space="preserve">Search</w:t>
-            </w:r>
-          </w:p>
-        </w:tc>
-        <w:tc>
-          <w:tcPr>
-            <w:tcW w:w="6300" w:type="dxa"/>
-          </w:tcPr>
-          <w:p>
-            <w:r>
-              <w:t xml:space="preserve">Runs the current search.</w:t>
-            </w:r>
-          </w:p>
-        </w:tc>
-      </w:tr>
-      <w:tr>
-        <w:tc>
-          <w:tcPr>
-            <w:tcW w:w="2700" w:type="dxa"/>
-            <w:shd w:val="clear" w:color="auto" w:fill="F5F5F5"/>
-          </w:tcPr>
-          <w:p>
-            <w:r>
-              <w:t xml:space="preserve">Clear results</w:t>
-            </w:r>
-          </w:p>
-        </w:tc>
-        <w:tc>
-          <w:tcPr>
-            <w:tcW w:w="6300" w:type="dxa"/>
-            <w:shd w:val="clear" w:color="auto" w:fill="F5F5F5"/>
-          </w:tcPr>
-          <w:p>
-            <w:r>
-              <w:t xml:space="preserve">Resets all search fields and removes all results from the tree.</w:t>
-            </w:r>
-          </w:p>
-        </w:tc>
-      </w:tr>
-      <w:tr>
-        <w:tc>
-          <w:tcPr>
-            <w:tcW w:w="2700" w:type="dxa"/>
-          </w:tcPr>
-          <w:p>
-            <w:r>
-              <w:t xml:space="preserve">Export…</w:t>
-            </w:r>
-          </w:p>
-        </w:tc>
-        <w:tc>
-          <w:tcPr>
-            <w:tcW w:w="6300" w:type="dxa"/>
-          </w:tcPr>
-          <w:p>
-            <w:r>
-              <w:t xml:space="preserve">Saves the current results tree to CSV or JSON.</w:t>
-            </w:r>
-          </w:p>
-        </w:tc>
-      </w:tr>
-      <w:tr>
-        <w:tc>
-          <w:tcPr>
-            <w:tcW w:w="2700" w:type="dxa"/>
-            <w:shd w:val="clear" w:color="auto" w:fill="F5F5F5"/>
-          </w:tcPr>
-          <w:p>
-            <w:r>
-              <w:t xml:space="preserve">Retrieve Selected</w:t>
-            </w:r>
-          </w:p>
-        </w:tc>
-        <w:tc>
-          <w:tcPr>
-            <w:tcW w:w="6300" w:type="dxa"/>
-            <w:shd w:val="clear" w:color="auto" w:fill="F5F5F5"/>
-          </w:tcPr>
-          <w:p>
-            <w:r>
-              <w:t xml:space="preserve">Starts retrieval of all currently selected tree nodes.</w:t>
-            </w:r>
-          </w:p>
-        </w:tc>
-      </w:tr>
-      <w:tr>
-        <w:tc>
-          <w:tcPr>
-            <w:tcW w:w="2700" w:type="dxa"/>
-          </w:tcPr>
-          <w:p>
-            <w:r>
-              <w:t xml:space="preserve">Cancel retrieve</w:t>
-            </w:r>
-          </w:p>
-        </w:tc>
-        <w:tc>
-          <w:tcPr>
-            <w:tcW w:w="6300" w:type="dxa"/>
-          </w:tcPr>
-          <w:p>
-            <w:r>
-              <w:t xml:space="preserve">Cancels an in-progress retrieval.</w:t>
+              <w:t xml:space="preserve">Action</w:t>
+            </w:r>
+          </w:p>
+        </w:tc>
+      </w:tr>
+      <w:tr>
+        <w:tc>
+          <w:tcPr>
+            <w:tcW w:w="2700" w:type="dxa"/>
+          </w:tcPr>
+          <w:p>
+            <w:r>
+              <w:t xml:space="preserve">Select All</w:t>
+            </w:r>
+          </w:p>
+        </w:tc>
+        <w:tc>
+          <w:tcPr>
+            <w:tcW w:w="6300" w:type="dxa"/>
+          </w:tcPr>
+          <w:p>
+            <w:r>
+              <w:t xml:space="preserve">Selects every currently visible (filtered) root node and all its descendants.</w:t>
+            </w:r>
+          </w:p>
+        </w:tc>
+      </w:tr>
+      <w:tr>
+        <w:tc>
+          <w:tcPr>
+            <w:tcW w:w="2700" w:type="dxa"/>
+            <w:shd w:val="clear" w:color="auto" w:fill="F5F5F5"/>
+          </w:tcPr>
+          <w:p>
+            <w:r>
+              <w:t xml:space="preserve">Clear Selection</w:t>
+            </w:r>
+          </w:p>
+        </w:tc>
+        <w:tc>
+          <w:tcPr>
+            <w:tcW w:w="6300" w:type="dxa"/>
+            <w:shd w:val="clear" w:color="auto" w:fill="F5F5F5"/>
+          </w:tcPr>
+          <w:p>
+            <w:r>
+              <w:t xml:space="preserve">Deselects everything.</w:t>
+            </w:r>
+          </w:p>
+        </w:tc>
+      </w:tr>
+      <w:tr>
+        <w:tc>
+          <w:tcPr>
+            <w:tcW w:w="2700" w:type="dxa"/>
+          </w:tcPr>
+          <w:p>
+            <w:r>
+              <w:t xml:space="preserve">Push Selected…</w:t>
+            </w:r>
+          </w:p>
+        </w:tc>
+        <w:tc>
+          <w:tcPr>
+            <w:tcW w:w="6300" w:type="dxa"/>
+          </w:tcPr>
+          <w:p>
+            <w:r>
+              <w:t xml:space="preserve">Pushes all selected files to a chosen server.</w:t>
+            </w:r>
+          </w:p>
+        </w:tc>
+      </w:tr>
+      <w:tr>
+        <w:tc>
+          <w:tcPr>
+            <w:tcW w:w="2700" w:type="dxa"/>
+            <w:shd w:val="clear" w:color="auto" w:fill="F5F5F5"/>
+          </w:tcPr>
+          <w:p>
+            <w:r>
+              <w:t xml:space="preserve">Delete Selected…</w:t>
+            </w:r>
+          </w:p>
+        </w:tc>
+        <w:tc>
+          <w:tcPr>
+            <w:tcW w:w="6300" w:type="dxa"/>
+            <w:shd w:val="clear" w:color="auto" w:fill="F5F5F5"/>
+          </w:tcPr>
+          <w:p>
+            <w:r>
+              <w:t xml:space="preserve">Deletes all selected files after confirmation.</w:t>
             </w:r>
           </w:p>
         </w:tc>
@@ -3504,10 +3268,85 @@
     <w:p/>
     <w:p>
       <w:pPr>
+        <w:pStyle w:val="Heading1"/>
+      </w:pPr>
+      <w:r>
+        <w:t>9  Import Tab</w:t>
+      </w:r>
+    </w:p>
+    <w:p>
+      <w:r>
+        <w:t xml:space="preserve">The Import tab copies DICOM files from any folder into the organised download folder, applying the same Patient / Study / Series subfolder structure used by retrieval.</w:t>
+      </w:r>
+    </w:p>
+    <w:p>
+      <w:pPr>
         <w:pStyle w:val="Heading2"/>
       </w:pPr>
       <w:r>
-        <w:t>12.3  Help Menu</w:t>
+        <w:t>9.1  Scanning a Source Folder</w:t>
+      </w:r>
+    </w:p>
+    <w:p>
+      <w:r>
+        <w:t xml:space="preserve">Enter or browse to a source folder and click Scan. dicomqr walks the folder and builds a tree of studies and series found in it. The destination folder (the configured download folder) is shown read-only below the source field.</w:t>
+      </w:r>
+    </w:p>
+    <w:p>
+      <w:pPr>
+        <w:pStyle w:val="Heading2"/>
+      </w:pPr>
+      <w:r>
+        <w:t>9.2  Selecting and Importing</w:t>
+      </w:r>
+    </w:p>
+    <w:p>
+      <w:r>
+        <w:t xml:space="preserve">Click rows in the tree to select them. Click Import Selected to copy the selected files. Files already present in the destination (same SOP Instance UID at the same destination path) are skipped; the status label reports imported, already-present, and failed counts.</w:t>
+      </w:r>
+    </w:p>
+    <w:p>
+      <w:r>
+        <w:t xml:space="preserve">Select All and Clear Selection buttons are provided. The filter bar narrows the tree in the same way as the other tabs.</w:t>
+      </w:r>
+    </w:p>
+    <w:p>
+      <w:pPr>
+        <w:pStyle w:val="Heading1"/>
+      </w:pPr>
+      <w:r>
+        <w:t>10  Worklist Tab</w:t>
+      </w:r>
+    </w:p>
+    <w:p>
+      <w:r>
+        <w:t xml:space="preserve">The Worklist tab queries a Modality Worklist server for scheduled imaging procedures. It operates independently of the PACS Query tab — it does not require a PACS connection and can target a different server (typically a RIS or MWL broker).</w:t>
+      </w:r>
+    </w:p>
+    <w:p>
+      <w:pPr>
+        <w:pStyle w:val="Heading2"/>
+      </w:pPr>
+      <w:r>
+        <w:t>10.1  Selecting a Worklist Server</w:t>
+      </w:r>
+    </w:p>
+    <w:p>
+      <w:r>
+        <w:t xml:space="preserve">Choose any configured server profile from the Worklist server dropdown. The dropdown updates when server profiles are added or removed in Preferences. The query connects to the selected profile's host, port, and AE Title for each query and releases the association immediately after.</w:t>
+      </w:r>
+    </w:p>
+    <w:p>
+      <w:r>
+        <w:t xml:space="preserve">Note: the Modality Worklist SOP class (1.2.840.10008.5.1.4.31) must be enabled on the target server. In most environments this is a separate system from the PACS — configure a server profile pointing to that system.</w:t>
+      </w:r>
+    </w:p>
+    <w:p>
+      <w:pPr>
+        <w:pStyle w:val="Heading2"/>
+      </w:pPr>
+      <w:r>
+        <w:t>10.2  Query Fields</w:t>
       </w:r>
     </w:p>
     <w:tbl>
@@ -3546,7 +3385,7 @@
                 <w:sz w:val="20"/>
                 <w:szCs w:val="20"/>
               </w:rPr>
-              <w:t xml:space="preserve">Item</w:t>
+              <w:t xml:space="preserve">Field</w:t>
             </w:r>
           </w:p>
         </w:tc>
@@ -3575,63 +3414,121 @@
           </w:tcPr>
           <w:p>
             <w:r>
-              <w:t xml:space="preserve">Activity Log…</w:t>
-            </w:r>
-          </w:p>
-        </w:tc>
-        <w:tc>
-          <w:tcPr>
-            <w:tcW w:w="6300" w:type="dxa"/>
-          </w:tcPr>
-          <w:p>
-            <w:r>
-              <w:t xml:space="preserve">Opens the in-app activity log showing the last 500 lines of the DICOM protocol log. Buttons: Refresh (manual update), Copy All (clipboard), Clear. The log auto-refreshes once per second while the dialog is open.</w:t>
-            </w:r>
-          </w:p>
-        </w:tc>
-      </w:tr>
-      <w:tr>
-        <w:tc>
-          <w:tcPr>
-            <w:tcW w:w="2700" w:type="dxa"/>
-            <w:shd w:val="clear" w:color="auto" w:fill="F5F5F5"/>
-          </w:tcPr>
-          <w:p>
-            <w:r>
-              <w:t xml:space="preserve">About</w:t>
-            </w:r>
-          </w:p>
-        </w:tc>
-        <w:tc>
-          <w:tcPr>
-            <w:tcW w:w="6300" w:type="dxa"/>
-            <w:shd w:val="clear" w:color="auto" w:fill="F5F5F5"/>
-          </w:tcPr>
-          <w:p>
-            <w:r>
-              <w:t xml:space="preserve">Displays the application version, build date, and library credits.</w:t>
-            </w:r>
-          </w:p>
-        </w:tc>
-      </w:tr>
-      <w:tr>
-        <w:tc>
-          <w:tcPr>
-            <w:tcW w:w="2700" w:type="dxa"/>
-          </w:tcPr>
-          <w:p>
-            <w:r>
-              <w:t xml:space="preserve">Client info…</w:t>
-            </w:r>
-          </w:p>
-        </w:tc>
-        <w:tc>
-          <w:tcPr>
-            <w:tcW w:w="6300" w:type="dxa"/>
-          </w:tcPr>
-          <w:p>
-            <w:r>
-              <w:t xml:space="preserve">Displays the local AE Title, SCP port, and detected IP address.</w:t>
+              <w:t xml:space="preserve">Patient Name</w:t>
+            </w:r>
+          </w:p>
+        </w:tc>
+        <w:tc>
+          <w:tcPr>
+            <w:tcW w:w="6300" w:type="dxa"/>
+          </w:tcPr>
+          <w:p>
+            <w:r>
+              <w:t xml:space="preserve">Wildcard-capable patient name match. A trailing </w:t>
+            </w:r>
+            <w:r>
+              <w:rPr>
+                <w:rFonts w:ascii="Courier New" w:hAnsi="Courier New"/>
+                <w:sz w:val="18"/>
+                <w:szCs w:val="18"/>
+                <w:shd w:val="clear" w:color="auto" w:fill="EBEBEB"/>
+              </w:rPr>
+              <w:t xml:space="preserve">*</w:t>
+            </w:r>
+            <w:r>
+              <w:t xml:space="preserve"> is appended automatically. Leave blank to match all patients.</w:t>
+            </w:r>
+          </w:p>
+        </w:tc>
+      </w:tr>
+      <w:tr>
+        <w:tc>
+          <w:tcPr>
+            <w:tcW w:w="2700" w:type="dxa"/>
+            <w:shd w:val="clear" w:color="auto" w:fill="F5F5F5"/>
+          </w:tcPr>
+          <w:p>
+            <w:r>
+              <w:t xml:space="preserve">MRN</w:t>
+            </w:r>
+          </w:p>
+        </w:tc>
+        <w:tc>
+          <w:tcPr>
+            <w:tcW w:w="6300" w:type="dxa"/>
+            <w:shd w:val="clear" w:color="auto" w:fill="F5F5F5"/>
+          </w:tcPr>
+          <w:p>
+            <w:r>
+              <w:t xml:space="preserve">Wildcard-capable Patient ID match.</w:t>
+            </w:r>
+          </w:p>
+        </w:tc>
+      </w:tr>
+      <w:tr>
+        <w:tc>
+          <w:tcPr>
+            <w:tcW w:w="2700" w:type="dxa"/>
+          </w:tcPr>
+          <w:p>
+            <w:r>
+              <w:t xml:space="preserve">Accession</w:t>
+            </w:r>
+          </w:p>
+        </w:tc>
+        <w:tc>
+          <w:tcPr>
+            <w:tcW w:w="6300" w:type="dxa"/>
+          </w:tcPr>
+          <w:p>
+            <w:r>
+              <w:t xml:space="preserve">Wildcard-capable Accession Number match.</w:t>
+            </w:r>
+          </w:p>
+        </w:tc>
+      </w:tr>
+      <w:tr>
+        <w:tc>
+          <w:tcPr>
+            <w:tcW w:w="2700" w:type="dxa"/>
+            <w:shd w:val="clear" w:color="auto" w:fill="F5F5F5"/>
+          </w:tcPr>
+          <w:p>
+            <w:r>
+              <w:t xml:space="preserve">Modality</w:t>
+            </w:r>
+          </w:p>
+        </w:tc>
+        <w:tc>
+          <w:tcPr>
+            <w:tcW w:w="6300" w:type="dxa"/>
+            <w:shd w:val="clear" w:color="auto" w:fill="F5F5F5"/>
+          </w:tcPr>
+          <w:p>
+            <w:r>
+              <w:t xml:space="preserve">Restricts results to one modality. Select (any) to include all modalities.</w:t>
+            </w:r>
+          </w:p>
+        </w:tc>
+      </w:tr>
+      <w:tr>
+        <w:tc>
+          <w:tcPr>
+            <w:tcW w:w="2700" w:type="dxa"/>
+          </w:tcPr>
+          <w:p>
+            <w:r>
+              <w:t xml:space="preserve">Scheduled date</w:t>
+            </w:r>
+          </w:p>
+        </w:tc>
+        <w:tc>
+          <w:tcPr>
+            <w:tcW w:w="6300" w:type="dxa"/>
+          </w:tcPr>
+          <w:p>
+            <w:r>
+              <w:t xml:space="preserve">Today only (checked by default) — restricts to today's scheduled date. Uncheck to select a specific date using the calendar picker. Leave blank (unchecked, no date selected) to return all scheduled dates.</w:t>
             </w:r>
           </w:p>
         </w:tc>
@@ -3639,11 +3536,182 @@
     </w:tbl>
     <w:p/>
     <w:p>
+      <w:r>
+        <w:t xml:space="preserve">Click Query Worklist or press Enter in any text field to run the query. Click Clear to reset all fields and clear the results.</w:t>
+      </w:r>
+    </w:p>
+    <w:p>
+      <w:pPr>
+        <w:pStyle w:val="Heading2"/>
+      </w:pPr>
+      <w:r>
+        <w:t>10.3  Results Table</w:t>
+      </w:r>
+    </w:p>
+    <w:p>
+      <w:r>
+        <w:t xml:space="preserve">Results are shown in a table with columns: Patient, MRN, Accession, Date, Time, Modality, Procedure, and Station. Click any row to select it.</w:t>
+      </w:r>
+    </w:p>
+    <w:p>
+      <w:r>
+        <w:t xml:space="preserve">Copy Accession and Copy Patient buttons copy the selected row's values to the clipboard. The status label shows the number of worklist items returned, or any error message.</w:t>
+      </w:r>
+    </w:p>
+    <w:p>
+      <w:pPr>
+        <w:pStyle w:val="Heading2"/>
+      </w:pPr>
+      <w:r>
+        <w:t>10.4  Typical Use Cases</w:t>
+      </w:r>
+    </w:p>
+    <w:p>
+      <w:pPr>
+        <w:pStyle w:val="ListBullet"/>
+      </w:pPr>
+      <w:r>
+        <w:t xml:space="preserve">Verify a scheduled procedure — query by patient name or accession to confirm an order reached the worklist server before the patient arrives at the scanner.</w:t>
+      </w:r>
+    </w:p>
+    <w:p>
+      <w:pPr>
+        <w:pStyle w:val="ListBullet"/>
+      </w:pPr>
+      <w:r>
+        <w:t xml:space="preserve">Diagnose "patient not on scanner" — if a technologist cannot find a patient on the modality's worklist, query here; if the entry appears, the problem is in the scanner's MWL configuration; if it does not, the order was not transmitted to the worklist server.</w:t>
+      </w:r>
+    </w:p>
+    <w:p>
+      <w:pPr>
+        <w:pStyle w:val="ListBullet"/>
+      </w:pPr>
+      <w:r>
+        <w:t xml:space="preserve">Look up an accession number — copy the accession and switch to PACS Query to search for the matching study.</w:t>
+      </w:r>
+    </w:p>
+    <w:p>
       <w:pPr>
         <w:pStyle w:val="Heading1"/>
       </w:pPr>
       <w:r>
-        <w:t>13  Keyboard Shortcuts</w:t>
+        <w:t>11  Downloaded Files</w:t>
+      </w:r>
+    </w:p>
+    <w:p>
+      <w:r>
+        <w:t xml:space="preserve">Files are written to the folder specified in the Download to field. Within that folder, dicomqr creates a three-level subfolder structure:</w:t>
+      </w:r>
+    </w:p>
+    <w:p>
+      <w:pPr>
+        <w:pStyle w:val="Code"/>
+      </w:pPr>
+      <w:r>
+        <w:t xml:space="preserve">&lt;Download folder&gt;\</w:t>
+      </w:r>
+    </w:p>
+    <w:p>
+      <w:pPr>
+        <w:pStyle w:val="Code"/>
+      </w:pPr>
+      <w:r>
+        <w:t xml:space="preserve">    &lt;Patient Name&gt; (&lt;Patient ID&gt;)\</w:t>
+      </w:r>
+    </w:p>
+    <w:p>
+      <w:pPr>
+        <w:pStyle w:val="Code"/>
+      </w:pPr>
+      <w:r>
+        <w:t xml:space="preserve">        &lt;Study Description&gt; (&lt;Study Date&gt;)\</w:t>
+      </w:r>
+    </w:p>
+    <w:p>
+      <w:pPr>
+        <w:pStyle w:val="Code"/>
+      </w:pPr>
+      <w:r>
+        <w:t xml:space="preserve">            &lt;Series Description&gt; (&lt;Series Number&gt;)\</w:t>
+      </w:r>
+    </w:p>
+    <w:p>
+      <w:pPr>
+        <w:pStyle w:val="Code"/>
+      </w:pPr>
+      <w:r>
+        <w:t xml:space="preserve">                &lt;SOP Instance UID&gt;.dcm</w:t>
+      </w:r>
+    </w:p>
+    <w:p>
+      <w:r>
+        <w:t xml:space="preserve">For example:</w:t>
+      </w:r>
+    </w:p>
+    <w:p>
+      <w:pPr>
+        <w:pStyle w:val="Code"/>
+      </w:pPr>
+      <w:r>
+        <w:t xml:space="preserve">Downloads\</w:t>
+      </w:r>
+    </w:p>
+    <w:p>
+      <w:pPr>
+        <w:pStyle w:val="Code"/>
+      </w:pPr>
+      <w:r>
+        <w:t xml:space="preserve">    Doe^John (MRN12345)\</w:t>
+      </w:r>
+    </w:p>
+    <w:p>
+      <w:pPr>
+        <w:pStyle w:val="Code"/>
+      </w:pPr>
+      <w:r>
+        <w:t xml:space="preserve">        Chest CT (20240115)\</w:t>
+      </w:r>
+    </w:p>
+    <w:p>
+      <w:pPr>
+        <w:pStyle w:val="Code"/>
+      </w:pPr>
+      <w:r>
+        <w:t xml:space="preserve">            Chest W Contrast (2)\</w:t>
+      </w:r>
+    </w:p>
+    <w:p>
+      <w:pPr>
+        <w:pStyle w:val="Code"/>
+      </w:pPr>
+      <w:r>
+        <w:t xml:space="preserve">                1.2.840.10008.5.1.4.1.1.2.dcm</w:t>
+      </w:r>
+    </w:p>
+    <w:p>
+      <w:r>
+        <w:t xml:space="preserve">If a metadata field is absent from the DICOM file, the corresponding folder component falls back to a descriptive placeholder: Unknown Patient, Unknown Study, or Unknown Series. Characters that are not permitted in Windows file or folder names are replaced with underscores.</w:t>
+      </w:r>
+    </w:p>
+    <w:p>
+      <w:r>
+        <w:t xml:space="preserve">Each SOP Instance UID is unique, so files from different studies that share the same patient ID and series number are written to separate subfolders and are never overwritten.</w:t>
+      </w:r>
+    </w:p>
+    <w:p>
+      <w:pPr>
+        <w:pStyle w:val="Heading1"/>
+      </w:pPr>
+      <w:r>
+        <w:t>12  Menus</w:t>
+      </w:r>
+    </w:p>
+    <w:p>
+      <w:pPr>
+        <w:pStyle w:val="Heading2"/>
+      </w:pPr>
+      <w:r>
+        <w:t>12.1  File Menu</w:t>
       </w:r>
     </w:p>
     <w:tbl>
@@ -3682,7 +3750,7 @@
                 <w:sz w:val="20"/>
                 <w:szCs w:val="20"/>
               </w:rPr>
-              <w:t xml:space="preserve">Shortcut</w:t>
+              <w:t xml:space="preserve">Item</w:t>
             </w:r>
           </w:p>
         </w:tc>
@@ -3699,121 +3767,99 @@
                 <w:sz w:val="20"/>
                 <w:szCs w:val="20"/>
               </w:rPr>
-              <w:t xml:space="preserve">Action</w:t>
-            </w:r>
-          </w:p>
-        </w:tc>
-      </w:tr>
-      <w:tr>
-        <w:tc>
-          <w:tcPr>
-            <w:tcW w:w="2700" w:type="dxa"/>
-          </w:tcPr>
-          <w:p>
-            <w:r>
-              <w:t xml:space="preserve">Ctrl+Enter</w:t>
-            </w:r>
-          </w:p>
-        </w:tc>
-        <w:tc>
-          <w:tcPr>
-            <w:tcW w:w="6300" w:type="dxa"/>
-          </w:tcPr>
-          <w:p>
-            <w:r>
-              <w:t xml:space="preserve">Run the current search.</w:t>
-            </w:r>
-          </w:p>
-        </w:tc>
-      </w:tr>
-      <w:tr>
-        <w:tc>
-          <w:tcPr>
-            <w:tcW w:w="2700" w:type="dxa"/>
-            <w:shd w:val="clear" w:color="auto" w:fill="F5F5F5"/>
-          </w:tcPr>
-          <w:p>
-            <w:r>
-              <w:t xml:space="preserve">Ctrl+F</w:t>
-            </w:r>
-          </w:p>
-        </w:tc>
-        <w:tc>
-          <w:tcPr>
-            <w:tcW w:w="6300" w:type="dxa"/>
-            <w:shd w:val="clear" w:color="auto" w:fill="F5F5F5"/>
-          </w:tcPr>
-          <w:p>
-            <w:r>
-              <w:t xml:space="preserve">Move focus to the Patient Name field in the Filters panel.</w:t>
-            </w:r>
-          </w:p>
-        </w:tc>
-      </w:tr>
-      <w:tr>
-        <w:tc>
-          <w:tcPr>
-            <w:tcW w:w="2700" w:type="dxa"/>
-          </w:tcPr>
-          <w:p>
-            <w:r>
-              <w:t xml:space="preserve">Ctrl+R</w:t>
-            </w:r>
-          </w:p>
-        </w:tc>
-        <w:tc>
-          <w:tcPr>
-            <w:tcW w:w="6300" w:type="dxa"/>
-          </w:tcPr>
-          <w:p>
-            <w:r>
-              <w:t xml:space="preserve">Retrieve the currently selected items.</w:t>
-            </w:r>
-          </w:p>
-        </w:tc>
-      </w:tr>
-      <w:tr>
-        <w:tc>
-          <w:tcPr>
-            <w:tcW w:w="2700" w:type="dxa"/>
-            <w:shd w:val="clear" w:color="auto" w:fill="F5F5F5"/>
-          </w:tcPr>
-          <w:p>
-            <w:r>
-              <w:t xml:space="preserve">Ctrl+C</w:t>
-            </w:r>
-          </w:p>
-        </w:tc>
-        <w:tc>
-          <w:tcPr>
-            <w:tcW w:w="6300" w:type="dxa"/>
-            <w:shd w:val="clear" w:color="auto" w:fill="F5F5F5"/>
-          </w:tcPr>
-          <w:p>
-            <w:r>
-              <w:t xml:space="preserve">Copy the full label of the currently selected result row to the clipboard.</w:t>
-            </w:r>
-          </w:p>
-        </w:tc>
-      </w:tr>
-      <w:tr>
-        <w:tc>
-          <w:tcPr>
-            <w:tcW w:w="2700" w:type="dxa"/>
-          </w:tcPr>
-          <w:p>
-            <w:r>
-              <w:t xml:space="preserve">Esc</w:t>
-            </w:r>
-          </w:p>
-        </w:tc>
-        <w:tc>
-          <w:tcPr>
-            <w:tcW w:w="6300" w:type="dxa"/>
-          </w:tcPr>
-          <w:p>
-            <w:r>
-              <w:t xml:space="preserve">Clear the current selection in the results tree.</w:t>
+              <w:t xml:space="preserve">Description</w:t>
+            </w:r>
+          </w:p>
+        </w:tc>
+      </w:tr>
+      <w:tr>
+        <w:tc>
+          <w:tcPr>
+            <w:tcW w:w="2700" w:type="dxa"/>
+          </w:tcPr>
+          <w:p>
+            <w:r>
+              <w:t xml:space="preserve">Connect</w:t>
+            </w:r>
+          </w:p>
+        </w:tc>
+        <w:tc>
+          <w:tcPr>
+            <w:tcW w:w="6300" w:type="dxa"/>
+          </w:tcPr>
+          <w:p>
+            <w:r>
+              <w:t xml:space="preserve">Connects to the currently selected server profile.</w:t>
+            </w:r>
+          </w:p>
+        </w:tc>
+      </w:tr>
+      <w:tr>
+        <w:tc>
+          <w:tcPr>
+            <w:tcW w:w="2700" w:type="dxa"/>
+            <w:shd w:val="clear" w:color="auto" w:fill="F5F5F5"/>
+          </w:tcPr>
+          <w:p>
+            <w:r>
+              <w:t xml:space="preserve">Disconnect</w:t>
+            </w:r>
+          </w:p>
+        </w:tc>
+        <w:tc>
+          <w:tcPr>
+            <w:tcW w:w="6300" w:type="dxa"/>
+            <w:shd w:val="clear" w:color="auto" w:fill="F5F5F5"/>
+          </w:tcPr>
+          <w:p>
+            <w:r>
+              <w:t xml:space="preserve">Ends the current session and stops the local SCP listener.</w:t>
+            </w:r>
+          </w:p>
+        </w:tc>
+      </w:tr>
+      <w:tr>
+        <w:tc>
+          <w:tcPr>
+            <w:tcW w:w="2700" w:type="dxa"/>
+          </w:tcPr>
+          <w:p>
+            <w:r>
+              <w:t xml:space="preserve">Preferences…</w:t>
+            </w:r>
+          </w:p>
+        </w:tc>
+        <w:tc>
+          <w:tcPr>
+            <w:tcW w:w="6300" w:type="dxa"/>
+          </w:tcPr>
+          <w:p>
+            <w:r>
+              <w:t xml:space="preserve">Opens the Preferences dialog. See Section 14.</w:t>
+            </w:r>
+          </w:p>
+        </w:tc>
+      </w:tr>
+      <w:tr>
+        <w:tc>
+          <w:tcPr>
+            <w:tcW w:w="2700" w:type="dxa"/>
+            <w:shd w:val="clear" w:color="auto" w:fill="F5F5F5"/>
+          </w:tcPr>
+          <w:p>
+            <w:r>
+              <w:t xml:space="preserve">Quit</w:t>
+            </w:r>
+          </w:p>
+        </w:tc>
+        <w:tc>
+          <w:tcPr>
+            <w:tcW w:w="6300" w:type="dxa"/>
+            <w:shd w:val="clear" w:color="auto" w:fill="F5F5F5"/>
+          </w:tcPr>
+          <w:p>
+            <w:r>
+              <w:t xml:space="preserve">Exits the application.</w:t>
             </w:r>
           </w:p>
         </w:tc>
@@ -3822,23 +3868,10 @@
     <w:p/>
     <w:p>
       <w:pPr>
-        <w:pStyle w:val="Heading1"/>
-      </w:pPr>
-      <w:r>
-        <w:t>14  Preferences</w:t>
-      </w:r>
-    </w:p>
-    <w:p>
-      <w:r>
-        <w:t xml:space="preserve">Open the Preferences dialog from File &gt; Preferences…. Changes take effect when Apply is clicked and are written immediately to disk.</w:t>
-      </w:r>
-    </w:p>
-    <w:p>
-      <w:pPr>
         <w:pStyle w:val="Heading2"/>
       </w:pPr>
       <w:r>
-        <w:t>14.1  UI Section</w:t>
+        <w:t>12.2  Query Menu</w:t>
       </w:r>
     </w:p>
     <w:tbl>
@@ -3877,7 +3910,7 @@
                 <w:sz w:val="20"/>
                 <w:szCs w:val="20"/>
               </w:rPr>
-              <w:t xml:space="preserve">Setting</w:t>
+              <w:t xml:space="preserve">Item</w:t>
             </w:r>
           </w:p>
         </w:tc>
@@ -3906,87 +3939,109 @@
           </w:tcPr>
           <w:p>
             <w:r>
-              <w:t xml:space="preserve">Theme</w:t>
-            </w:r>
-          </w:p>
-        </w:tc>
-        <w:tc>
-          <w:tcPr>
-            <w:tcW w:w="6300" w:type="dxa"/>
-          </w:tcPr>
-          <w:p>
-            <w:r>
-              <w:t xml:space="preserve">Selects the application colour theme: Light or Dark.</w:t>
-            </w:r>
-          </w:p>
-        </w:tc>
-      </w:tr>
-      <w:tr>
-        <w:tc>
-          <w:tcPr>
-            <w:tcW w:w="2700" w:type="dxa"/>
-            <w:shd w:val="clear" w:color="auto" w:fill="F5F5F5"/>
-          </w:tcPr>
-          <w:p>
-            <w:r>
-              <w:t xml:space="preserve">Tree font</w:t>
-            </w:r>
-          </w:p>
-        </w:tc>
-        <w:tc>
-          <w:tcPr>
-            <w:tcW w:w="6300" w:type="dxa"/>
-            <w:shd w:val="clear" w:color="auto" w:fill="F5F5F5"/>
-          </w:tcPr>
-          <w:p>
-            <w:r>
-              <w:t xml:space="preserve">Selects the font used for results tree rows. Select (default) to use the application's built-in font.</w:t>
-            </w:r>
-          </w:p>
-        </w:tc>
-      </w:tr>
-      <w:tr>
-        <w:tc>
-          <w:tcPr>
-            <w:tcW w:w="2700" w:type="dxa"/>
-          </w:tcPr>
-          <w:p>
-            <w:r>
-              <w:t xml:space="preserve">Selection colour</w:t>
-            </w:r>
-          </w:p>
-        </w:tc>
-        <w:tc>
-          <w:tcPr>
-            <w:tcW w:w="6300" w:type="dxa"/>
-          </w:tcPr>
-          <w:p>
-            <w:r>
-              <w:t xml:space="preserve">The colour applied to selected rows. Click Choose colour… to open a colour picker. If unset, selected rows follow the theme's primary accent colour.</w:t>
-            </w:r>
-          </w:p>
-        </w:tc>
-      </w:tr>
-      <w:tr>
-        <w:tc>
-          <w:tcPr>
-            <w:tcW w:w="2700" w:type="dxa"/>
-            <w:shd w:val="clear" w:color="auto" w:fill="F5F5F5"/>
-          </w:tcPr>
-          <w:p>
-            <w:r>
-              <w:t xml:space="preserve">Selection style</w:t>
-            </w:r>
-          </w:p>
-        </w:tc>
-        <w:tc>
-          <w:tcPr>
-            <w:tcW w:w="6300" w:type="dxa"/>
-            <w:shd w:val="clear" w:color="auto" w:fill="F5F5F5"/>
-          </w:tcPr>
-          <w:p>
-            <w:r>
-              <w:t xml:space="preserve">The font style applied to selected rows: Bold and/or Italic.</w:t>
+              <w:t xml:space="preserve">Search</w:t>
+            </w:r>
+          </w:p>
+        </w:tc>
+        <w:tc>
+          <w:tcPr>
+            <w:tcW w:w="6300" w:type="dxa"/>
+          </w:tcPr>
+          <w:p>
+            <w:r>
+              <w:t xml:space="preserve">Runs the current search.</w:t>
+            </w:r>
+          </w:p>
+        </w:tc>
+      </w:tr>
+      <w:tr>
+        <w:tc>
+          <w:tcPr>
+            <w:tcW w:w="2700" w:type="dxa"/>
+            <w:shd w:val="clear" w:color="auto" w:fill="F5F5F5"/>
+          </w:tcPr>
+          <w:p>
+            <w:r>
+              <w:t xml:space="preserve">Clear results</w:t>
+            </w:r>
+          </w:p>
+        </w:tc>
+        <w:tc>
+          <w:tcPr>
+            <w:tcW w:w="6300" w:type="dxa"/>
+            <w:shd w:val="clear" w:color="auto" w:fill="F5F5F5"/>
+          </w:tcPr>
+          <w:p>
+            <w:r>
+              <w:t xml:space="preserve">Resets all search fields and removes all results from the tree.</w:t>
+            </w:r>
+          </w:p>
+        </w:tc>
+      </w:tr>
+      <w:tr>
+        <w:tc>
+          <w:tcPr>
+            <w:tcW w:w="2700" w:type="dxa"/>
+          </w:tcPr>
+          <w:p>
+            <w:r>
+              <w:t xml:space="preserve">Export…</w:t>
+            </w:r>
+          </w:p>
+        </w:tc>
+        <w:tc>
+          <w:tcPr>
+            <w:tcW w:w="6300" w:type="dxa"/>
+          </w:tcPr>
+          <w:p>
+            <w:r>
+              <w:t xml:space="preserve">Saves the current results tree to CSV or JSON.</w:t>
+            </w:r>
+          </w:p>
+        </w:tc>
+      </w:tr>
+      <w:tr>
+        <w:tc>
+          <w:tcPr>
+            <w:tcW w:w="2700" w:type="dxa"/>
+            <w:shd w:val="clear" w:color="auto" w:fill="F5F5F5"/>
+          </w:tcPr>
+          <w:p>
+            <w:r>
+              <w:t xml:space="preserve">Retrieve Selected</w:t>
+            </w:r>
+          </w:p>
+        </w:tc>
+        <w:tc>
+          <w:tcPr>
+            <w:tcW w:w="6300" w:type="dxa"/>
+            <w:shd w:val="clear" w:color="auto" w:fill="F5F5F5"/>
+          </w:tcPr>
+          <w:p>
+            <w:r>
+              <w:t xml:space="preserve">Starts retrieval of all currently selected tree nodes.</w:t>
+            </w:r>
+          </w:p>
+        </w:tc>
+      </w:tr>
+      <w:tr>
+        <w:tc>
+          <w:tcPr>
+            <w:tcW w:w="2700" w:type="dxa"/>
+          </w:tcPr>
+          <w:p>
+            <w:r>
+              <w:t xml:space="preserve">Cancel retrieve</w:t>
+            </w:r>
+          </w:p>
+        </w:tc>
+        <w:tc>
+          <w:tcPr>
+            <w:tcW w:w="6300" w:type="dxa"/>
+          </w:tcPr>
+          <w:p>
+            <w:r>
+              <w:t xml:space="preserve">Cancels an in-progress retrieval.</w:t>
             </w:r>
           </w:p>
         </w:tc>
@@ -3998,17 +4053,7 @@
         <w:pStyle w:val="Heading2"/>
       </w:pPr>
       <w:r>
-        <w:t>14.2  Connections Section</w:t>
-      </w:r>
-    </w:p>
-    <w:p>
-      <w:r>
-        <w:t xml:space="preserve">Lists all saved server profiles. Click Edit to modify, Delete to remove, or Add server… to create a new profile. The Up/Down buttons reorder the list; the first profile is the default selection when the application starts.</w:t>
-      </w:r>
-    </w:p>
-    <w:p>
-      <w:r>
-        <w:t xml:space="preserve">Profile editor fields:</w:t>
+        <w:t>12.3  Help Menu</w:t>
       </w:r>
     </w:p>
     <w:tbl>
@@ -4047,7 +4092,7 @@
                 <w:sz w:val="20"/>
                 <w:szCs w:val="20"/>
               </w:rPr>
-              <w:t xml:space="preserve">Field</w:t>
+              <w:t xml:space="preserve">Item</w:t>
             </w:r>
           </w:p>
         </w:tc>
@@ -4076,212 +4121,63 @@
           </w:tcPr>
           <w:p>
             <w:r>
-              <w:t xml:space="preserve">Profile name</w:t>
-            </w:r>
-          </w:p>
-        </w:tc>
-        <w:tc>
-          <w:tcPr>
-            <w:tcW w:w="6300" w:type="dxa"/>
-          </w:tcPr>
-          <w:p>
-            <w:r>
-              <w:t xml:space="preserve">A descriptive label shown in the server dropdown and the Worklist tab.</w:t>
-            </w:r>
-          </w:p>
-        </w:tc>
-      </w:tr>
-      <w:tr>
-        <w:tc>
-          <w:tcPr>
-            <w:tcW w:w="2700" w:type="dxa"/>
-            <w:shd w:val="clear" w:color="auto" w:fill="F5F5F5"/>
-          </w:tcPr>
-          <w:p>
-            <w:r>
-              <w:t xml:space="preserve">Remote AE Title</w:t>
-            </w:r>
-          </w:p>
-        </w:tc>
-        <w:tc>
-          <w:tcPr>
-            <w:tcW w:w="6300" w:type="dxa"/>
-            <w:shd w:val="clear" w:color="auto" w:fill="F5F5F5"/>
-          </w:tcPr>
-          <w:p>
-            <w:r>
-              <w:t xml:space="preserve">The AE Title of the PACS or MWL server (case-sensitive, uppercase recommended).</w:t>
-            </w:r>
-          </w:p>
-        </w:tc>
-      </w:tr>
-      <w:tr>
-        <w:tc>
-          <w:tcPr>
-            <w:tcW w:w="2700" w:type="dxa"/>
-          </w:tcPr>
-          <w:p>
-            <w:r>
-              <w:t xml:space="preserve">Host</w:t>
-            </w:r>
-          </w:p>
-        </w:tc>
-        <w:tc>
-          <w:tcPr>
-            <w:tcW w:w="6300" w:type="dxa"/>
-          </w:tcPr>
-          <w:p>
-            <w:r>
-              <w:t xml:space="preserve">The hostname or IP address of the server.</w:t>
-            </w:r>
-          </w:p>
-        </w:tc>
-      </w:tr>
-      <w:tr>
-        <w:tc>
-          <w:tcPr>
-            <w:tcW w:w="2700" w:type="dxa"/>
-            <w:shd w:val="clear" w:color="auto" w:fill="F5F5F5"/>
-          </w:tcPr>
-          <w:p>
-            <w:r>
-              <w:t xml:space="preserve">Port</w:t>
-            </w:r>
-          </w:p>
-        </w:tc>
-        <w:tc>
-          <w:tcPr>
-            <w:tcW w:w="6300" w:type="dxa"/>
-            <w:shd w:val="clear" w:color="auto" w:fill="F5F5F5"/>
-          </w:tcPr>
-          <w:p>
-            <w:r>
-              <w:t xml:space="preserve">The TCP port of the DICOM service (commonly 104 or 11112).</w:t>
-            </w:r>
-          </w:p>
-        </w:tc>
-      </w:tr>
-      <w:tr>
-        <w:tc>
-          <w:tcPr>
-            <w:tcW w:w="2700" w:type="dxa"/>
-          </w:tcPr>
-          <w:p>
-            <w:r>
-              <w:t xml:space="preserve">Info model</w:t>
-            </w:r>
-          </w:p>
-        </w:tc>
-        <w:tc>
-          <w:tcPr>
-            <w:tcW w:w="6300" w:type="dxa"/>
-          </w:tcPr>
-          <w:p>
-            <w:r>
-              <w:rPr>
-                <w:rFonts w:ascii="Courier New" w:hAnsi="Courier New"/>
-                <w:sz w:val="18"/>
-                <w:szCs w:val="18"/>
-                <w:shd w:val="clear" w:color="auto" w:fill="EBEBEB"/>
-              </w:rPr>
-              <w:t xml:space="preserve">study</w:t>
-            </w:r>
-            <w:r>
-              <w:t xml:space="preserve"> — Study Root (default, most common). </w:t>
-            </w:r>
-            <w:r>
-              <w:rPr>
-                <w:rFonts w:ascii="Courier New" w:hAnsi="Courier New"/>
-                <w:sz w:val="18"/>
-                <w:szCs w:val="18"/>
-                <w:shd w:val="clear" w:color="auto" w:fill="EBEBEB"/>
-              </w:rPr>
-              <w:t xml:space="preserve">patient</w:t>
-            </w:r>
-            <w:r>
-              <w:t xml:space="preserve"> — Patient Root. </w:t>
-            </w:r>
-            <w:r>
-              <w:rPr>
-                <w:rFonts w:ascii="Courier New" w:hAnsi="Courier New"/>
-                <w:sz w:val="18"/>
-                <w:szCs w:val="18"/>
-                <w:shd w:val="clear" w:color="auto" w:fill="EBEBEB"/>
-              </w:rPr>
-              <w:t xml:space="preserve">patient-study-only</w:t>
-            </w:r>
-            <w:r>
-              <w:t xml:space="preserve"> — legacy retired model; SERIES-level lazy-load is suppressed automatically.</w:t>
-            </w:r>
-          </w:p>
-        </w:tc>
-      </w:tr>
-      <w:tr>
-        <w:tc>
-          <w:tcPr>
-            <w:tcW w:w="2700" w:type="dxa"/>
-            <w:shd w:val="clear" w:color="auto" w:fill="F5F5F5"/>
-          </w:tcPr>
-          <w:p>
-            <w:r>
-              <w:t xml:space="preserve">Retrieve method</w:t>
-            </w:r>
-          </w:p>
-        </w:tc>
-        <w:tc>
-          <w:tcPr>
-            <w:tcW w:w="6300" w:type="dxa"/>
-            <w:shd w:val="clear" w:color="auto" w:fill="F5F5F5"/>
-          </w:tcPr>
-          <w:p>
-            <w:r>
-              <w:t xml:space="preserve">C-MOVE / C-GET / Auto — see Section 4.1.</w:t>
-            </w:r>
-          </w:p>
-        </w:tc>
-      </w:tr>
-      <w:tr>
-        <w:tc>
-          <w:tcPr>
-            <w:tcW w:w="2700" w:type="dxa"/>
-          </w:tcPr>
-          <w:p>
-            <w:r>
-              <w:t xml:space="preserve">Connect timeout</w:t>
-            </w:r>
-          </w:p>
-        </w:tc>
-        <w:tc>
-          <w:tcPr>
-            <w:tcW w:w="6300" w:type="dxa"/>
-          </w:tcPr>
-          <w:p>
-            <w:r>
-              <w:t xml:space="preserve">Seconds before a connection attempt is considered failed.</w:t>
-            </w:r>
-          </w:p>
-        </w:tc>
-      </w:tr>
-      <w:tr>
-        <w:tc>
-          <w:tcPr>
-            <w:tcW w:w="2700" w:type="dxa"/>
-            <w:shd w:val="clear" w:color="auto" w:fill="F5F5F5"/>
-          </w:tcPr>
-          <w:p>
-            <w:r>
-              <w:t xml:space="preserve">Transfer</w:t>
-            </w:r>
-          </w:p>
-        </w:tc>
-        <w:tc>
-          <w:tcPr>
-            <w:tcW w:w="6300" w:type="dxa"/>
-            <w:shd w:val="clear" w:color="auto" w:fill="F5F5F5"/>
-          </w:tcPr>
-          <w:p>
-            <w:r>
-              <w:t xml:space="preserve">When ticked, negotiates only uncompressed transfer syntaxes — see Section 4.1 for full details and caveats.</w:t>
+              <w:t xml:space="preserve">Activity Log…</w:t>
+            </w:r>
+          </w:p>
+        </w:tc>
+        <w:tc>
+          <w:tcPr>
+            <w:tcW w:w="6300" w:type="dxa"/>
+          </w:tcPr>
+          <w:p>
+            <w:r>
+              <w:t xml:space="preserve">Opens the in-app activity log showing the last 500 lines of the DICOM protocol log. Buttons: Refresh (manual update), Copy All (clipboard), Clear. The log auto-refreshes once per second while the dialog is open.</w:t>
+            </w:r>
+          </w:p>
+        </w:tc>
+      </w:tr>
+      <w:tr>
+        <w:tc>
+          <w:tcPr>
+            <w:tcW w:w="2700" w:type="dxa"/>
+            <w:shd w:val="clear" w:color="auto" w:fill="F5F5F5"/>
+          </w:tcPr>
+          <w:p>
+            <w:r>
+              <w:t xml:space="preserve">About</w:t>
+            </w:r>
+          </w:p>
+        </w:tc>
+        <w:tc>
+          <w:tcPr>
+            <w:tcW w:w="6300" w:type="dxa"/>
+            <w:shd w:val="clear" w:color="auto" w:fill="F5F5F5"/>
+          </w:tcPr>
+          <w:p>
+            <w:r>
+              <w:t xml:space="preserve">Displays the application version, build date, and library credits.</w:t>
+            </w:r>
+          </w:p>
+        </w:tc>
+      </w:tr>
+      <w:tr>
+        <w:tc>
+          <w:tcPr>
+            <w:tcW w:w="2700" w:type="dxa"/>
+          </w:tcPr>
+          <w:p>
+            <w:r>
+              <w:t xml:space="preserve">Client info…</w:t>
+            </w:r>
+          </w:p>
+        </w:tc>
+        <w:tc>
+          <w:tcPr>
+            <w:tcW w:w="6300" w:type="dxa"/>
+          </w:tcPr>
+          <w:p>
+            <w:r>
+              <w:t xml:space="preserve">Displays the local AE Title, SCP port, and detected IP address.</w:t>
             </w:r>
           </w:p>
         </w:tc>
@@ -4290,10 +4186,10 @@
     <w:p/>
     <w:p>
       <w:pPr>
-        <w:pStyle w:val="Heading2"/>
-      </w:pPr>
-      <w:r>
-        <w:t>14.3  Retrieve Section</w:t>
+        <w:pStyle w:val="Heading1"/>
+      </w:pPr>
+      <w:r>
+        <w:t>13  Keyboard Shortcuts</w:t>
       </w:r>
     </w:p>
     <w:tbl>
@@ -4332,7 +4228,7 @@
                 <w:sz w:val="20"/>
                 <w:szCs w:val="20"/>
               </w:rPr>
-              <w:t xml:space="preserve">Setting</w:t>
+              <w:t xml:space="preserve">Shortcut</w:t>
             </w:r>
           </w:p>
         </w:tc>
@@ -4349,75 +4245,121 @@
                 <w:sz w:val="20"/>
                 <w:szCs w:val="20"/>
               </w:rPr>
-              <w:t xml:space="preserve">Description</w:t>
-            </w:r>
-          </w:p>
-        </w:tc>
-      </w:tr>
-      <w:tr>
-        <w:tc>
-          <w:tcPr>
-            <w:tcW w:w="2700" w:type="dxa"/>
-          </w:tcPr>
-          <w:p>
-            <w:r>
-              <w:t xml:space="preserve">Local AE Title</w:t>
-            </w:r>
-          </w:p>
-        </w:tc>
-        <w:tc>
-          <w:tcPr>
-            <w:tcW w:w="6300" w:type="dxa"/>
-          </w:tcPr>
-          <w:p>
-            <w:r>
-              <w:t xml:space="preserve">The AE Title this workstation presents during DICOM associations. Default: DICOMQR.</w:t>
-            </w:r>
-          </w:p>
-        </w:tc>
-      </w:tr>
-      <w:tr>
-        <w:tc>
-          <w:tcPr>
-            <w:tcW w:w="2700" w:type="dxa"/>
-            <w:shd w:val="clear" w:color="auto" w:fill="F5F5F5"/>
-          </w:tcPr>
-          <w:p>
-            <w:r>
-              <w:t xml:space="preserve">Local SCP port</w:t>
-            </w:r>
-          </w:p>
-        </w:tc>
-        <w:tc>
-          <w:tcPr>
-            <w:tcW w:w="6300" w:type="dxa"/>
-            <w:shd w:val="clear" w:color="auto" w:fill="F5F5F5"/>
-          </w:tcPr>
-          <w:p>
-            <w:r>
-              <w:t xml:space="preserve">The TCP port on which the embedded C-STORE listener accepts incoming connections. Default: 11112.</w:t>
-            </w:r>
-          </w:p>
-        </w:tc>
-      </w:tr>
-      <w:tr>
-        <w:tc>
-          <w:tcPr>
-            <w:tcW w:w="2700" w:type="dxa"/>
-          </w:tcPr>
-          <w:p>
-            <w:r>
-              <w:t xml:space="preserve">Download folder</w:t>
-            </w:r>
-          </w:p>
-        </w:tc>
-        <w:tc>
-          <w:tcPr>
-            <w:tcW w:w="6300" w:type="dxa"/>
-          </w:tcPr>
-          <w:p>
-            <w:r>
-              <w:t xml:space="preserve">The root folder where retrieved and imported DICOM files are written.</w:t>
+              <w:t xml:space="preserve">Action</w:t>
+            </w:r>
+          </w:p>
+        </w:tc>
+      </w:tr>
+      <w:tr>
+        <w:tc>
+          <w:tcPr>
+            <w:tcW w:w="2700" w:type="dxa"/>
+          </w:tcPr>
+          <w:p>
+            <w:r>
+              <w:t xml:space="preserve">Ctrl+Enter</w:t>
+            </w:r>
+          </w:p>
+        </w:tc>
+        <w:tc>
+          <w:tcPr>
+            <w:tcW w:w="6300" w:type="dxa"/>
+          </w:tcPr>
+          <w:p>
+            <w:r>
+              <w:t xml:space="preserve">Run the current search.</w:t>
+            </w:r>
+          </w:p>
+        </w:tc>
+      </w:tr>
+      <w:tr>
+        <w:tc>
+          <w:tcPr>
+            <w:tcW w:w="2700" w:type="dxa"/>
+            <w:shd w:val="clear" w:color="auto" w:fill="F5F5F5"/>
+          </w:tcPr>
+          <w:p>
+            <w:r>
+              <w:t xml:space="preserve">Ctrl+F</w:t>
+            </w:r>
+          </w:p>
+        </w:tc>
+        <w:tc>
+          <w:tcPr>
+            <w:tcW w:w="6300" w:type="dxa"/>
+            <w:shd w:val="clear" w:color="auto" w:fill="F5F5F5"/>
+          </w:tcPr>
+          <w:p>
+            <w:r>
+              <w:t xml:space="preserve">Move focus to the Patient Name field in the Filters panel.</w:t>
+            </w:r>
+          </w:p>
+        </w:tc>
+      </w:tr>
+      <w:tr>
+        <w:tc>
+          <w:tcPr>
+            <w:tcW w:w="2700" w:type="dxa"/>
+          </w:tcPr>
+          <w:p>
+            <w:r>
+              <w:t xml:space="preserve">Ctrl+R</w:t>
+            </w:r>
+          </w:p>
+        </w:tc>
+        <w:tc>
+          <w:tcPr>
+            <w:tcW w:w="6300" w:type="dxa"/>
+          </w:tcPr>
+          <w:p>
+            <w:r>
+              <w:t xml:space="preserve">Retrieve the currently selected items.</w:t>
+            </w:r>
+          </w:p>
+        </w:tc>
+      </w:tr>
+      <w:tr>
+        <w:tc>
+          <w:tcPr>
+            <w:tcW w:w="2700" w:type="dxa"/>
+            <w:shd w:val="clear" w:color="auto" w:fill="F5F5F5"/>
+          </w:tcPr>
+          <w:p>
+            <w:r>
+              <w:t xml:space="preserve">Ctrl+C</w:t>
+            </w:r>
+          </w:p>
+        </w:tc>
+        <w:tc>
+          <w:tcPr>
+            <w:tcW w:w="6300" w:type="dxa"/>
+            <w:shd w:val="clear" w:color="auto" w:fill="F5F5F5"/>
+          </w:tcPr>
+          <w:p>
+            <w:r>
+              <w:t xml:space="preserve">Copy the full label of the currently selected result row to the clipboard.</w:t>
+            </w:r>
+          </w:p>
+        </w:tc>
+      </w:tr>
+      <w:tr>
+        <w:tc>
+          <w:tcPr>
+            <w:tcW w:w="2700" w:type="dxa"/>
+          </w:tcPr>
+          <w:p>
+            <w:r>
+              <w:t xml:space="preserve">Esc</w:t>
+            </w:r>
+          </w:p>
+        </w:tc>
+        <w:tc>
+          <w:tcPr>
+            <w:tcW w:w="6300" w:type="dxa"/>
+          </w:tcPr>
+          <w:p>
+            <w:r>
+              <w:t xml:space="preserve">Clear the current selection in the results tree.</w:t>
             </w:r>
           </w:p>
         </w:tc>
@@ -4425,8 +4367,16 @@
     </w:tbl>
     <w:p/>
     <w:p>
-      <w:r>
-        <w:t xml:space="preserve">Changes to AE Title or SCP port take effect the next time a connection is established.</w:t>
+      <w:pPr>
+        <w:pStyle w:val="Heading1"/>
+      </w:pPr>
+      <w:r>
+        <w:t>14  Preferences</w:t>
+      </w:r>
+    </w:p>
+    <w:p>
+      <w:r>
+        <w:t xml:space="preserve">Open the Preferences dialog from File &gt; Preferences…. Changes take effect when Apply is clicked and are written immediately to disk.</w:t>
       </w:r>
     </w:p>
     <w:p>
@@ -4434,7 +4384,7 @@
         <w:pStyle w:val="Heading2"/>
       </w:pPr>
       <w:r>
-        <w:t>14.4  Image Viewer Section</w:t>
+        <w:t>14.1  UI Section</w:t>
       </w:r>
     </w:p>
     <w:tbl>
@@ -4502,17 +4452,87 @@
           </w:tcPr>
           <w:p>
             <w:r>
-              <w:t xml:space="preserve">External viewer</w:t>
-            </w:r>
-          </w:p>
-        </w:tc>
-        <w:tc>
-          <w:tcPr>
-            <w:tcW w:w="6300" w:type="dxa"/>
-          </w:tcPr>
-          <w:p>
-            <w:r>
-              <w:t xml:space="preserve">Full path to an external DICOM viewer executable. Click Browse… to locate it, or Auto-detect to search for MicroDicom or RadiAnt DICOM Viewer in the standard installation locations. When left empty, the Open in Viewer buttons and menu items are disabled.</w:t>
+              <w:t xml:space="preserve">Theme</w:t>
+            </w:r>
+          </w:p>
+        </w:tc>
+        <w:tc>
+          <w:tcPr>
+            <w:tcW w:w="6300" w:type="dxa"/>
+          </w:tcPr>
+          <w:p>
+            <w:r>
+              <w:t xml:space="preserve">Selects the application colour theme: Light or Dark.</w:t>
+            </w:r>
+          </w:p>
+        </w:tc>
+      </w:tr>
+      <w:tr>
+        <w:tc>
+          <w:tcPr>
+            <w:tcW w:w="2700" w:type="dxa"/>
+            <w:shd w:val="clear" w:color="auto" w:fill="F5F5F5"/>
+          </w:tcPr>
+          <w:p>
+            <w:r>
+              <w:t xml:space="preserve">Tree font</w:t>
+            </w:r>
+          </w:p>
+        </w:tc>
+        <w:tc>
+          <w:tcPr>
+            <w:tcW w:w="6300" w:type="dxa"/>
+            <w:shd w:val="clear" w:color="auto" w:fill="F5F5F5"/>
+          </w:tcPr>
+          <w:p>
+            <w:r>
+              <w:t xml:space="preserve">Selects the font used for results tree rows. Select (default) to use the application's built-in font.</w:t>
+            </w:r>
+          </w:p>
+        </w:tc>
+      </w:tr>
+      <w:tr>
+        <w:tc>
+          <w:tcPr>
+            <w:tcW w:w="2700" w:type="dxa"/>
+          </w:tcPr>
+          <w:p>
+            <w:r>
+              <w:t xml:space="preserve">Selection colour</w:t>
+            </w:r>
+          </w:p>
+        </w:tc>
+        <w:tc>
+          <w:tcPr>
+            <w:tcW w:w="6300" w:type="dxa"/>
+          </w:tcPr>
+          <w:p>
+            <w:r>
+              <w:t xml:space="preserve">The colour applied to selected rows. Click Choose colour… to open a colour picker. If unset, selected rows follow the theme's primary accent colour.</w:t>
+            </w:r>
+          </w:p>
+        </w:tc>
+      </w:tr>
+      <w:tr>
+        <w:tc>
+          <w:tcPr>
+            <w:tcW w:w="2700" w:type="dxa"/>
+            <w:shd w:val="clear" w:color="auto" w:fill="F5F5F5"/>
+          </w:tcPr>
+          <w:p>
+            <w:r>
+              <w:t xml:space="preserve">Selection style</w:t>
+            </w:r>
+          </w:p>
+        </w:tc>
+        <w:tc>
+          <w:tcPr>
+            <w:tcW w:w="6300" w:type="dxa"/>
+            <w:shd w:val="clear" w:color="auto" w:fill="F5F5F5"/>
+          </w:tcPr>
+          <w:p>
+            <w:r>
+              <w:t xml:space="preserve">The font style applied to selected rows: Bold and/or Italic.</w:t>
             </w:r>
           </w:p>
         </w:tc>
@@ -4521,15 +4541,20 @@
     <w:p/>
     <w:p>
       <w:pPr>
-        <w:pStyle w:val="Heading1"/>
-      </w:pPr>
-      <w:r>
-        <w:t>15  Status Bar</w:t>
-      </w:r>
-    </w:p>
-    <w:p>
-      <w:r>
-        <w:t xml:space="preserve">The status bar at the bottom of the window provides real-time feedback. A coloured LED indicator (gray / amber / green) precedes the status text.</w:t>
+        <w:pStyle w:val="Heading2"/>
+      </w:pPr>
+      <w:r>
+        <w:t>14.2  Connections Section</w:t>
+      </w:r>
+    </w:p>
+    <w:p>
+      <w:r>
+        <w:t xml:space="preserve">Lists all saved server profiles. Click Edit to modify, Delete to remove, or Add server… to create a new profile. The Up/Down buttons reorder the list; the first profile is the default selection when the application starts.</w:t>
+      </w:r>
+    </w:p>
+    <w:p>
+      <w:r>
+        <w:t xml:space="preserve">Profile editor fields:</w:t>
       </w:r>
     </w:p>
     <w:tbl>
@@ -4568,7 +4593,7 @@
                 <w:sz w:val="20"/>
                 <w:szCs w:val="20"/>
               </w:rPr>
-              <w:t xml:space="preserve">Situation</w:t>
+              <w:t xml:space="preserve">Field</w:t>
             </w:r>
           </w:p>
         </w:tc>
@@ -4585,19 +4610,111 @@
                 <w:sz w:val="20"/>
                 <w:szCs w:val="20"/>
               </w:rPr>
-              <w:t xml:space="preserve">Status bar text</w:t>
-            </w:r>
-          </w:p>
-        </w:tc>
-      </w:tr>
-      <w:tr>
-        <w:tc>
-          <w:tcPr>
-            <w:tcW w:w="2700" w:type="dxa"/>
-          </w:tcPr>
-          <w:p>
-            <w:r>
-              <w:t xml:space="preserve">Application started, not connected</w:t>
+              <w:t xml:space="preserve">Description</w:t>
+            </w:r>
+          </w:p>
+        </w:tc>
+      </w:tr>
+      <w:tr>
+        <w:tc>
+          <w:tcPr>
+            <w:tcW w:w="2700" w:type="dxa"/>
+          </w:tcPr>
+          <w:p>
+            <w:r>
+              <w:t xml:space="preserve">Profile name</w:t>
+            </w:r>
+          </w:p>
+        </w:tc>
+        <w:tc>
+          <w:tcPr>
+            <w:tcW w:w="6300" w:type="dxa"/>
+          </w:tcPr>
+          <w:p>
+            <w:r>
+              <w:t xml:space="preserve">A descriptive label shown in the server dropdown and the Worklist tab.</w:t>
+            </w:r>
+          </w:p>
+        </w:tc>
+      </w:tr>
+      <w:tr>
+        <w:tc>
+          <w:tcPr>
+            <w:tcW w:w="2700" w:type="dxa"/>
+            <w:shd w:val="clear" w:color="auto" w:fill="F5F5F5"/>
+          </w:tcPr>
+          <w:p>
+            <w:r>
+              <w:t xml:space="preserve">Remote AE Title</w:t>
+            </w:r>
+          </w:p>
+        </w:tc>
+        <w:tc>
+          <w:tcPr>
+            <w:tcW w:w="6300" w:type="dxa"/>
+            <w:shd w:val="clear" w:color="auto" w:fill="F5F5F5"/>
+          </w:tcPr>
+          <w:p>
+            <w:r>
+              <w:t xml:space="preserve">The AE Title of the PACS or MWL server (case-sensitive, uppercase recommended).</w:t>
+            </w:r>
+          </w:p>
+        </w:tc>
+      </w:tr>
+      <w:tr>
+        <w:tc>
+          <w:tcPr>
+            <w:tcW w:w="2700" w:type="dxa"/>
+          </w:tcPr>
+          <w:p>
+            <w:r>
+              <w:t xml:space="preserve">Host</w:t>
+            </w:r>
+          </w:p>
+        </w:tc>
+        <w:tc>
+          <w:tcPr>
+            <w:tcW w:w="6300" w:type="dxa"/>
+          </w:tcPr>
+          <w:p>
+            <w:r>
+              <w:t xml:space="preserve">The hostname or IP address of the server.</w:t>
+            </w:r>
+          </w:p>
+        </w:tc>
+      </w:tr>
+      <w:tr>
+        <w:tc>
+          <w:tcPr>
+            <w:tcW w:w="2700" w:type="dxa"/>
+            <w:shd w:val="clear" w:color="auto" w:fill="F5F5F5"/>
+          </w:tcPr>
+          <w:p>
+            <w:r>
+              <w:t xml:space="preserve">Port</w:t>
+            </w:r>
+          </w:p>
+        </w:tc>
+        <w:tc>
+          <w:tcPr>
+            <w:tcW w:w="6300" w:type="dxa"/>
+            <w:shd w:val="clear" w:color="auto" w:fill="F5F5F5"/>
+          </w:tcPr>
+          <w:p>
+            <w:r>
+              <w:t xml:space="preserve">The TCP port of the DICOM service (commonly 104 or 11112).</w:t>
+            </w:r>
+          </w:p>
+        </w:tc>
+      </w:tr>
+      <w:tr>
+        <w:tc>
+          <w:tcPr>
+            <w:tcW w:w="2700" w:type="dxa"/>
+          </w:tcPr>
+          <w:p>
+            <w:r>
+              <w:t xml:space="preserve">Info model</w:t>
             </w:r>
           </w:p>
         </w:tc>
@@ -4613,7 +4730,436 @@
                 <w:szCs w:val="18"/>
                 <w:shd w:val="clear" w:color="auto" w:fill="EBEBEB"/>
               </w:rPr>
-              <w:t xml:space="preserve">v1.2.0</w:t>
+              <w:t xml:space="preserve">study</w:t>
+            </w:r>
+            <w:r>
+              <w:t xml:space="preserve"> — Study Root (default, most common). </w:t>
+            </w:r>
+            <w:r>
+              <w:rPr>
+                <w:rFonts w:ascii="Courier New" w:hAnsi="Courier New"/>
+                <w:sz w:val="18"/>
+                <w:szCs w:val="18"/>
+                <w:shd w:val="clear" w:color="auto" w:fill="EBEBEB"/>
+              </w:rPr>
+              <w:t xml:space="preserve">patient</w:t>
+            </w:r>
+            <w:r>
+              <w:t xml:space="preserve"> — Patient Root. </w:t>
+            </w:r>
+            <w:r>
+              <w:rPr>
+                <w:rFonts w:ascii="Courier New" w:hAnsi="Courier New"/>
+                <w:sz w:val="18"/>
+                <w:szCs w:val="18"/>
+                <w:shd w:val="clear" w:color="auto" w:fill="EBEBEB"/>
+              </w:rPr>
+              <w:t xml:space="preserve">patient-study-only</w:t>
+            </w:r>
+            <w:r>
+              <w:t xml:space="preserve"> — legacy retired model; SERIES-level lazy-load is suppressed automatically.</w:t>
+            </w:r>
+          </w:p>
+        </w:tc>
+      </w:tr>
+      <w:tr>
+        <w:tc>
+          <w:tcPr>
+            <w:tcW w:w="2700" w:type="dxa"/>
+            <w:shd w:val="clear" w:color="auto" w:fill="F5F5F5"/>
+          </w:tcPr>
+          <w:p>
+            <w:r>
+              <w:t xml:space="preserve">Retrieve method</w:t>
+            </w:r>
+          </w:p>
+        </w:tc>
+        <w:tc>
+          <w:tcPr>
+            <w:tcW w:w="6300" w:type="dxa"/>
+            <w:shd w:val="clear" w:color="auto" w:fill="F5F5F5"/>
+          </w:tcPr>
+          <w:p>
+            <w:r>
+              <w:t xml:space="preserve">C-MOVE / C-GET / Auto — see Section 4.1.</w:t>
+            </w:r>
+          </w:p>
+        </w:tc>
+      </w:tr>
+      <w:tr>
+        <w:tc>
+          <w:tcPr>
+            <w:tcW w:w="2700" w:type="dxa"/>
+          </w:tcPr>
+          <w:p>
+            <w:r>
+              <w:t xml:space="preserve">Connect timeout</w:t>
+            </w:r>
+          </w:p>
+        </w:tc>
+        <w:tc>
+          <w:tcPr>
+            <w:tcW w:w="6300" w:type="dxa"/>
+          </w:tcPr>
+          <w:p>
+            <w:r>
+              <w:t xml:space="preserve">Seconds before a connection attempt is considered failed.</w:t>
+            </w:r>
+          </w:p>
+        </w:tc>
+      </w:tr>
+      <w:tr>
+        <w:tc>
+          <w:tcPr>
+            <w:tcW w:w="2700" w:type="dxa"/>
+            <w:shd w:val="clear" w:color="auto" w:fill="F5F5F5"/>
+          </w:tcPr>
+          <w:p>
+            <w:r>
+              <w:t xml:space="preserve">Transfer</w:t>
+            </w:r>
+          </w:p>
+        </w:tc>
+        <w:tc>
+          <w:tcPr>
+            <w:tcW w:w="6300" w:type="dxa"/>
+            <w:shd w:val="clear" w:color="auto" w:fill="F5F5F5"/>
+          </w:tcPr>
+          <w:p>
+            <w:r>
+              <w:t xml:space="preserve">When ticked, negotiates only uncompressed transfer syntaxes — see Section 4.1 for full details and caveats.</w:t>
+            </w:r>
+          </w:p>
+        </w:tc>
+      </w:tr>
+    </w:tbl>
+    <w:p/>
+    <w:p>
+      <w:pPr>
+        <w:pStyle w:val="Heading2"/>
+      </w:pPr>
+      <w:r>
+        <w:t>14.3  Retrieve Section</w:t>
+      </w:r>
+    </w:p>
+    <w:tbl>
+      <w:tblPr>
+        <w:tblW w:w="0" w:type="auto"/>
+        <w:tblBorders>
+          <w:top w:val="single" w:sz="4" w:space="0" w:color="BBBBBB"/>
+          <w:left w:val="single" w:sz="4" w:space="0" w:color="BBBBBB"/>
+          <w:bottom w:val="single" w:sz="4" w:space="0" w:color="BBBBBB"/>
+          <w:right w:val="single" w:sz="4" w:space="0" w:color="BBBBBB"/>
+          <w:insideH w:val="single" w:sz="4" w:space="0" w:color="BBBBBB"/>
+          <w:insideV w:val="single" w:sz="4" w:space="0" w:color="BBBBBB"/>
+        </w:tblBorders>
+        <w:tblCellMar>
+          <w:top w:w="80" w:type="dxa"/>
+          <w:left w:w="140" w:type="dxa"/>
+          <w:bottom w:w="80" w:type="dxa"/>
+          <w:right w:w="140" w:type="dxa"/>
+        </w:tblCellMar>
+      </w:tblPr>
+      <w:tblGrid>
+        <w:gridCol w:w="2700"/>
+        <w:gridCol w:w="6300"/>
+      </w:tblGrid>
+      <w:tr>
+        <w:tc>
+          <w:tcPr>
+            <w:tcW w:w="2700" w:type="dxa"/>
+            <w:shd w:val="clear" w:color="auto" w:fill="2E74B5"/>
+          </w:tcPr>
+          <w:p>
+            <w:r>
+              <w:rPr>
+                <w:b/>
+                <w:color w:val="FFFFFF"/>
+                <w:sz w:val="20"/>
+                <w:szCs w:val="20"/>
+              </w:rPr>
+              <w:t xml:space="preserve">Setting</w:t>
+            </w:r>
+          </w:p>
+        </w:tc>
+        <w:tc>
+          <w:tcPr>
+            <w:tcW w:w="6300" w:type="dxa"/>
+            <w:shd w:val="clear" w:color="auto" w:fill="2E74B5"/>
+          </w:tcPr>
+          <w:p>
+            <w:r>
+              <w:rPr>
+                <w:b/>
+                <w:color w:val="FFFFFF"/>
+                <w:sz w:val="20"/>
+                <w:szCs w:val="20"/>
+              </w:rPr>
+              <w:t xml:space="preserve">Description</w:t>
+            </w:r>
+          </w:p>
+        </w:tc>
+      </w:tr>
+      <w:tr>
+        <w:tc>
+          <w:tcPr>
+            <w:tcW w:w="2700" w:type="dxa"/>
+          </w:tcPr>
+          <w:p>
+            <w:r>
+              <w:t xml:space="preserve">Local AE Title</w:t>
+            </w:r>
+          </w:p>
+        </w:tc>
+        <w:tc>
+          <w:tcPr>
+            <w:tcW w:w="6300" w:type="dxa"/>
+          </w:tcPr>
+          <w:p>
+            <w:r>
+              <w:t xml:space="preserve">The AE Title this workstation presents during DICOM associations. Default: DICOMQR.</w:t>
+            </w:r>
+          </w:p>
+        </w:tc>
+      </w:tr>
+      <w:tr>
+        <w:tc>
+          <w:tcPr>
+            <w:tcW w:w="2700" w:type="dxa"/>
+            <w:shd w:val="clear" w:color="auto" w:fill="F5F5F5"/>
+          </w:tcPr>
+          <w:p>
+            <w:r>
+              <w:t xml:space="preserve">Local SCP port</w:t>
+            </w:r>
+          </w:p>
+        </w:tc>
+        <w:tc>
+          <w:tcPr>
+            <w:tcW w:w="6300" w:type="dxa"/>
+            <w:shd w:val="clear" w:color="auto" w:fill="F5F5F5"/>
+          </w:tcPr>
+          <w:p>
+            <w:r>
+              <w:t xml:space="preserve">The TCP port on which the embedded C-STORE listener accepts incoming connections. Default: 11112.</w:t>
+            </w:r>
+          </w:p>
+        </w:tc>
+      </w:tr>
+      <w:tr>
+        <w:tc>
+          <w:tcPr>
+            <w:tcW w:w="2700" w:type="dxa"/>
+          </w:tcPr>
+          <w:p>
+            <w:r>
+              <w:t xml:space="preserve">Download folder</w:t>
+            </w:r>
+          </w:p>
+        </w:tc>
+        <w:tc>
+          <w:tcPr>
+            <w:tcW w:w="6300" w:type="dxa"/>
+          </w:tcPr>
+          <w:p>
+            <w:r>
+              <w:t xml:space="preserve">The root folder where retrieved and imported DICOM files are written.</w:t>
+            </w:r>
+          </w:p>
+        </w:tc>
+      </w:tr>
+    </w:tbl>
+    <w:p/>
+    <w:p>
+      <w:r>
+        <w:t xml:space="preserve">Changes to AE Title or SCP port take effect the next time a connection is established.</w:t>
+      </w:r>
+    </w:p>
+    <w:p>
+      <w:pPr>
+        <w:pStyle w:val="Heading2"/>
+      </w:pPr>
+      <w:r>
+        <w:t>14.4  Image Viewer Section</w:t>
+      </w:r>
+    </w:p>
+    <w:tbl>
+      <w:tblPr>
+        <w:tblW w:w="0" w:type="auto"/>
+        <w:tblBorders>
+          <w:top w:val="single" w:sz="4" w:space="0" w:color="BBBBBB"/>
+          <w:left w:val="single" w:sz="4" w:space="0" w:color="BBBBBB"/>
+          <w:bottom w:val="single" w:sz="4" w:space="0" w:color="BBBBBB"/>
+          <w:right w:val="single" w:sz="4" w:space="0" w:color="BBBBBB"/>
+          <w:insideH w:val="single" w:sz="4" w:space="0" w:color="BBBBBB"/>
+          <w:insideV w:val="single" w:sz="4" w:space="0" w:color="BBBBBB"/>
+        </w:tblBorders>
+        <w:tblCellMar>
+          <w:top w:w="80" w:type="dxa"/>
+          <w:left w:w="140" w:type="dxa"/>
+          <w:bottom w:w="80" w:type="dxa"/>
+          <w:right w:w="140" w:type="dxa"/>
+        </w:tblCellMar>
+      </w:tblPr>
+      <w:tblGrid>
+        <w:gridCol w:w="2700"/>
+        <w:gridCol w:w="6300"/>
+      </w:tblGrid>
+      <w:tr>
+        <w:tc>
+          <w:tcPr>
+            <w:tcW w:w="2700" w:type="dxa"/>
+            <w:shd w:val="clear" w:color="auto" w:fill="2E74B5"/>
+          </w:tcPr>
+          <w:p>
+            <w:r>
+              <w:rPr>
+                <w:b/>
+                <w:color w:val="FFFFFF"/>
+                <w:sz w:val="20"/>
+                <w:szCs w:val="20"/>
+              </w:rPr>
+              <w:t xml:space="preserve">Setting</w:t>
+            </w:r>
+          </w:p>
+        </w:tc>
+        <w:tc>
+          <w:tcPr>
+            <w:tcW w:w="6300" w:type="dxa"/>
+            <w:shd w:val="clear" w:color="auto" w:fill="2E74B5"/>
+          </w:tcPr>
+          <w:p>
+            <w:r>
+              <w:rPr>
+                <w:b/>
+                <w:color w:val="FFFFFF"/>
+                <w:sz w:val="20"/>
+                <w:szCs w:val="20"/>
+              </w:rPr>
+              <w:t xml:space="preserve">Description</w:t>
+            </w:r>
+          </w:p>
+        </w:tc>
+      </w:tr>
+      <w:tr>
+        <w:tc>
+          <w:tcPr>
+            <w:tcW w:w="2700" w:type="dxa"/>
+          </w:tcPr>
+          <w:p>
+            <w:r>
+              <w:t xml:space="preserve">External viewer</w:t>
+            </w:r>
+          </w:p>
+        </w:tc>
+        <w:tc>
+          <w:tcPr>
+            <w:tcW w:w="6300" w:type="dxa"/>
+          </w:tcPr>
+          <w:p>
+            <w:r>
+              <w:t xml:space="preserve">Full path to an external DICOM viewer executable. Click Browse… to locate it, or Auto-detect to search for MicroDicom or RadiAnt DICOM Viewer in the standard installation locations. When left empty, the Open in Viewer buttons and menu items are disabled.</w:t>
+            </w:r>
+          </w:p>
+        </w:tc>
+      </w:tr>
+    </w:tbl>
+    <w:p/>
+    <w:p>
+      <w:pPr>
+        <w:pStyle w:val="Heading1"/>
+      </w:pPr>
+      <w:r>
+        <w:t>15  Status Bar</w:t>
+      </w:r>
+    </w:p>
+    <w:p>
+      <w:r>
+        <w:t xml:space="preserve">The status bar at the bottom of the window provides real-time feedback. A coloured LED indicator (gray / amber / green) precedes the status text.</w:t>
+      </w:r>
+    </w:p>
+    <w:tbl>
+      <w:tblPr>
+        <w:tblW w:w="0" w:type="auto"/>
+        <w:tblBorders>
+          <w:top w:val="single" w:sz="4" w:space="0" w:color="BBBBBB"/>
+          <w:left w:val="single" w:sz="4" w:space="0" w:color="BBBBBB"/>
+          <w:bottom w:val="single" w:sz="4" w:space="0" w:color="BBBBBB"/>
+          <w:right w:val="single" w:sz="4" w:space="0" w:color="BBBBBB"/>
+          <w:insideH w:val="single" w:sz="4" w:space="0" w:color="BBBBBB"/>
+          <w:insideV w:val="single" w:sz="4" w:space="0" w:color="BBBBBB"/>
+        </w:tblBorders>
+        <w:tblCellMar>
+          <w:top w:w="80" w:type="dxa"/>
+          <w:left w:w="140" w:type="dxa"/>
+          <w:bottom w:w="80" w:type="dxa"/>
+          <w:right w:w="140" w:type="dxa"/>
+        </w:tblCellMar>
+      </w:tblPr>
+      <w:tblGrid>
+        <w:gridCol w:w="2700"/>
+        <w:gridCol w:w="6300"/>
+      </w:tblGrid>
+      <w:tr>
+        <w:tc>
+          <w:tcPr>
+            <w:tcW w:w="2700" w:type="dxa"/>
+            <w:shd w:val="clear" w:color="auto" w:fill="2E74B5"/>
+          </w:tcPr>
+          <w:p>
+            <w:r>
+              <w:rPr>
+                <w:b/>
+                <w:color w:val="FFFFFF"/>
+                <w:sz w:val="20"/>
+                <w:szCs w:val="20"/>
+              </w:rPr>
+              <w:t xml:space="preserve">Situation</w:t>
+            </w:r>
+          </w:p>
+        </w:tc>
+        <w:tc>
+          <w:tcPr>
+            <w:tcW w:w="6300" w:type="dxa"/>
+            <w:shd w:val="clear" w:color="auto" w:fill="2E74B5"/>
+          </w:tcPr>
+          <w:p>
+            <w:r>
+              <w:rPr>
+                <w:b/>
+                <w:color w:val="FFFFFF"/>
+                <w:sz w:val="20"/>
+                <w:szCs w:val="20"/>
+              </w:rPr>
+              <w:t xml:space="preserve">Status bar text</w:t>
+            </w:r>
+          </w:p>
+        </w:tc>
+      </w:tr>
+      <w:tr>
+        <w:tc>
+          <w:tcPr>
+            <w:tcW w:w="2700" w:type="dxa"/>
+          </w:tcPr>
+          <w:p>
+            <w:r>
+              <w:t xml:space="preserve">Application started, not connected</w:t>
+            </w:r>
+          </w:p>
+        </w:tc>
+        <w:tc>
+          <w:tcPr>
+            <w:tcW w:w="6300" w:type="dxa"/>
+          </w:tcPr>
+          <w:p>
+            <w:r>
+              <w:rPr>
+                <w:rFonts w:ascii="Courier New" w:hAnsi="Courier New"/>
+                <w:sz w:val="18"/>
+                <w:szCs w:val="18"/>
+                <w:shd w:val="clear" w:color="auto" w:fill="EBEBEB"/>
+              </w:rPr>
+              <w:t xml:space="preserve">v1.3.0</w:t>
             </w:r>
           </w:p>
         </w:tc>

</xml_diff>